<commit_message>
docs: add Hung's self/peer evaluation
</commit_message>
<xml_diff>
--- a/docs/report.docx
+++ b/docs/report.docx
@@ -5671,27 +5671,14 @@
       <w:r>
         <w:t xml:space="preserve">Figure </w:t>
       </w:r>
-      <w:r>
-        <w:fldChar w:fldCharType="begin"/>
-      </w:r>
-      <w:r>
-        <w:instrText xml:space="preserve"> SEQ Figure \* ARABIC </w:instrText>
-      </w:r>
-      <w:r>
-        <w:fldChar w:fldCharType="separate"/>
-      </w:r>
-      <w:r>
-        <w:rPr>
-          <w:noProof/>
-        </w:rPr>
-        <w:t>1</w:t>
-      </w:r>
-      <w:r>
-        <w:rPr>
-          <w:noProof/>
-        </w:rPr>
-        <w:fldChar w:fldCharType="end"/>
-      </w:r>
+      <w:fldSimple w:instr=" SEQ Figure \* ARABIC ">
+        <w:r>
+          <w:rPr>
+            <w:noProof/>
+          </w:rPr>
+          <w:t>1</w:t>
+        </w:r>
+      </w:fldSimple>
       <w:r>
         <w:rPr>
           <w:lang w:val="vi-VN"/>
@@ -6284,27 +6271,14 @@
       <w:r>
         <w:t xml:space="preserve">Figure </w:t>
       </w:r>
-      <w:r>
-        <w:fldChar w:fldCharType="begin"/>
-      </w:r>
-      <w:r>
-        <w:instrText xml:space="preserve"> SEQ Figure \* ARABIC </w:instrText>
-      </w:r>
-      <w:r>
-        <w:fldChar w:fldCharType="separate"/>
-      </w:r>
-      <w:r>
-        <w:rPr>
-          <w:noProof/>
-        </w:rPr>
-        <w:t>2</w:t>
-      </w:r>
-      <w:r>
-        <w:rPr>
-          <w:noProof/>
-        </w:rPr>
-        <w:fldChar w:fldCharType="end"/>
-      </w:r>
+      <w:fldSimple w:instr=" SEQ Figure \* ARABIC ">
+        <w:r>
+          <w:rPr>
+            <w:noProof/>
+          </w:rPr>
+          <w:t>2</w:t>
+        </w:r>
+      </w:fldSimple>
       <w:r>
         <w:rPr>
           <w:lang w:val="vi-VN"/>
@@ -6796,27 +6770,14 @@
       <w:r>
         <w:t xml:space="preserve">Figure </w:t>
       </w:r>
-      <w:r>
-        <w:fldChar w:fldCharType="begin"/>
-      </w:r>
-      <w:r>
-        <w:instrText xml:space="preserve"> SEQ Figure \* ARABIC </w:instrText>
-      </w:r>
-      <w:r>
-        <w:fldChar w:fldCharType="separate"/>
-      </w:r>
-      <w:r>
-        <w:rPr>
-          <w:noProof/>
-        </w:rPr>
-        <w:t>3</w:t>
-      </w:r>
-      <w:r>
-        <w:rPr>
-          <w:noProof/>
-        </w:rPr>
-        <w:fldChar w:fldCharType="end"/>
-      </w:r>
+      <w:fldSimple w:instr=" SEQ Figure \* ARABIC ">
+        <w:r>
+          <w:rPr>
+            <w:noProof/>
+          </w:rPr>
+          <w:t>3</w:t>
+        </w:r>
+      </w:fldSimple>
       <w:r>
         <w:rPr>
           <w:lang w:val="vi-VN"/>
@@ -14205,27 +14166,14 @@
       <w:r>
         <w:t xml:space="preserve">Figure </w:t>
       </w:r>
-      <w:r>
-        <w:fldChar w:fldCharType="begin"/>
-      </w:r>
-      <w:r>
-        <w:instrText xml:space="preserve"> SEQ Figure \* ARABIC </w:instrText>
-      </w:r>
-      <w:r>
-        <w:fldChar w:fldCharType="separate"/>
-      </w:r>
-      <w:r>
-        <w:rPr>
-          <w:noProof/>
-        </w:rPr>
-        <w:t>4</w:t>
-      </w:r>
-      <w:r>
-        <w:rPr>
-          <w:noProof/>
-        </w:rPr>
-        <w:fldChar w:fldCharType="end"/>
-      </w:r>
+      <w:fldSimple w:instr=" SEQ Figure \* ARABIC ">
+        <w:r>
+          <w:rPr>
+            <w:noProof/>
+          </w:rPr>
+          <w:t>4</w:t>
+        </w:r>
+      </w:fldSimple>
       <w:r>
         <w:t xml:space="preserve">: </w:t>
       </w:r>
@@ -14306,27 +14254,14 @@
       <w:r>
         <w:t xml:space="preserve">Figure </w:t>
       </w:r>
-      <w:r>
-        <w:fldChar w:fldCharType="begin"/>
-      </w:r>
-      <w:r>
-        <w:instrText xml:space="preserve"> SEQ Figure \* ARABIC </w:instrText>
-      </w:r>
-      <w:r>
-        <w:fldChar w:fldCharType="separate"/>
-      </w:r>
-      <w:r>
-        <w:rPr>
-          <w:noProof/>
-        </w:rPr>
-        <w:t>5</w:t>
-      </w:r>
-      <w:r>
-        <w:rPr>
-          <w:noProof/>
-        </w:rPr>
-        <w:fldChar w:fldCharType="end"/>
-      </w:r>
+      <w:fldSimple w:instr=" SEQ Figure \* ARABIC ">
+        <w:r>
+          <w:rPr>
+            <w:noProof/>
+          </w:rPr>
+          <w:t>5</w:t>
+        </w:r>
+      </w:fldSimple>
       <w:r>
         <w:rPr>
           <w:lang w:val="vi-VN"/>
@@ -15202,27 +15137,14 @@
       <w:r>
         <w:t xml:space="preserve">Figure </w:t>
       </w:r>
-      <w:r>
-        <w:fldChar w:fldCharType="begin"/>
-      </w:r>
-      <w:r>
-        <w:instrText xml:space="preserve"> SEQ Figure \* ARABIC </w:instrText>
-      </w:r>
-      <w:r>
-        <w:fldChar w:fldCharType="separate"/>
-      </w:r>
-      <w:r>
-        <w:rPr>
-          <w:noProof/>
-        </w:rPr>
-        <w:t>6</w:t>
-      </w:r>
-      <w:r>
-        <w:rPr>
-          <w:noProof/>
-        </w:rPr>
-        <w:fldChar w:fldCharType="end"/>
-      </w:r>
+      <w:fldSimple w:instr=" SEQ Figure \* ARABIC ">
+        <w:r>
+          <w:rPr>
+            <w:noProof/>
+          </w:rPr>
+          <w:t>6</w:t>
+        </w:r>
+      </w:fldSimple>
       <w:r>
         <w:rPr>
           <w:lang w:val="vi-VN"/>
@@ -15311,27 +15233,14 @@
       <w:r>
         <w:t xml:space="preserve">Figure </w:t>
       </w:r>
-      <w:r>
-        <w:fldChar w:fldCharType="begin"/>
-      </w:r>
-      <w:r>
-        <w:instrText xml:space="preserve"> SEQ Figure \* ARABIC </w:instrText>
-      </w:r>
-      <w:r>
-        <w:fldChar w:fldCharType="separate"/>
-      </w:r>
-      <w:r>
-        <w:rPr>
-          <w:noProof/>
-        </w:rPr>
-        <w:t>7</w:t>
-      </w:r>
-      <w:r>
-        <w:rPr>
-          <w:noProof/>
-        </w:rPr>
-        <w:fldChar w:fldCharType="end"/>
-      </w:r>
+      <w:fldSimple w:instr=" SEQ Figure \* ARABIC ">
+        <w:r>
+          <w:rPr>
+            <w:noProof/>
+          </w:rPr>
+          <w:t>7</w:t>
+        </w:r>
+      </w:fldSimple>
       <w:r>
         <w:rPr>
           <w:lang w:val="vi-VN"/>
@@ -15714,27 +15623,14 @@
       <w:r>
         <w:t xml:space="preserve">Figure </w:t>
       </w:r>
-      <w:r>
-        <w:fldChar w:fldCharType="begin"/>
-      </w:r>
-      <w:r>
-        <w:instrText xml:space="preserve"> SEQ Figure \* ARABIC </w:instrText>
-      </w:r>
-      <w:r>
-        <w:fldChar w:fldCharType="separate"/>
-      </w:r>
-      <w:r>
-        <w:rPr>
-          <w:noProof/>
-        </w:rPr>
-        <w:t>8</w:t>
-      </w:r>
-      <w:r>
-        <w:rPr>
-          <w:noProof/>
-        </w:rPr>
-        <w:fldChar w:fldCharType="end"/>
-      </w:r>
+      <w:fldSimple w:instr=" SEQ Figure \* ARABIC ">
+        <w:r>
+          <w:rPr>
+            <w:noProof/>
+          </w:rPr>
+          <w:t>8</w:t>
+        </w:r>
+      </w:fldSimple>
       <w:r>
         <w:t xml:space="preserve">: </w:t>
       </w:r>
@@ -16062,27 +15958,14 @@
       <w:r>
         <w:t xml:space="preserve">Figure </w:t>
       </w:r>
-      <w:r>
-        <w:fldChar w:fldCharType="begin"/>
-      </w:r>
-      <w:r>
-        <w:instrText xml:space="preserve"> SEQ Figure \* ARABIC </w:instrText>
-      </w:r>
-      <w:r>
-        <w:fldChar w:fldCharType="separate"/>
-      </w:r>
-      <w:r>
-        <w:rPr>
-          <w:noProof/>
-        </w:rPr>
-        <w:t>9</w:t>
-      </w:r>
-      <w:r>
-        <w:rPr>
-          <w:noProof/>
-        </w:rPr>
-        <w:fldChar w:fldCharType="end"/>
-      </w:r>
+      <w:fldSimple w:instr=" SEQ Figure \* ARABIC ">
+        <w:r>
+          <w:rPr>
+            <w:noProof/>
+          </w:rPr>
+          <w:t>9</w:t>
+        </w:r>
+      </w:fldSimple>
       <w:r>
         <w:rPr>
           <w:lang w:val="vi-VN"/>
@@ -16265,27 +16148,14 @@
       <w:r>
         <w:t xml:space="preserve">Figure </w:t>
       </w:r>
-      <w:r>
-        <w:fldChar w:fldCharType="begin"/>
-      </w:r>
-      <w:r>
-        <w:instrText xml:space="preserve"> SEQ Figure \* ARABIC </w:instrText>
-      </w:r>
-      <w:r>
-        <w:fldChar w:fldCharType="separate"/>
-      </w:r>
-      <w:r>
-        <w:rPr>
-          <w:noProof/>
-        </w:rPr>
-        <w:t>10</w:t>
-      </w:r>
-      <w:r>
-        <w:rPr>
-          <w:noProof/>
-        </w:rPr>
-        <w:fldChar w:fldCharType="end"/>
-      </w:r>
+      <w:fldSimple w:instr=" SEQ Figure \* ARABIC ">
+        <w:r>
+          <w:rPr>
+            <w:noProof/>
+          </w:rPr>
+          <w:t>10</w:t>
+        </w:r>
+      </w:fldSimple>
       <w:r>
         <w:rPr>
           <w:lang w:val="vi-VN"/>
@@ -16531,27 +16401,14 @@
       <w:r>
         <w:t xml:space="preserve">Figure </w:t>
       </w:r>
-      <w:r>
-        <w:fldChar w:fldCharType="begin"/>
-      </w:r>
-      <w:r>
-        <w:instrText xml:space="preserve"> SEQ Figure \* ARABIC </w:instrText>
-      </w:r>
-      <w:r>
-        <w:fldChar w:fldCharType="separate"/>
-      </w:r>
-      <w:r>
-        <w:rPr>
-          <w:noProof/>
-        </w:rPr>
-        <w:t>11</w:t>
-      </w:r>
-      <w:r>
-        <w:rPr>
-          <w:noProof/>
-        </w:rPr>
-        <w:fldChar w:fldCharType="end"/>
-      </w:r>
+      <w:fldSimple w:instr=" SEQ Figure \* ARABIC ">
+        <w:r>
+          <w:rPr>
+            <w:noProof/>
+          </w:rPr>
+          <w:t>11</w:t>
+        </w:r>
+      </w:fldSimple>
       <w:r>
         <w:rPr>
           <w:lang w:val="vi-VN"/>
@@ -18792,6 +18649,117 @@
     </w:p>
     <w:p>
       <w:pPr>
+        <w:pStyle w:val="Heading3"/>
+        <w:numPr>
+          <w:ilvl w:val="2"/>
+          <w:numId w:val="1"/>
+        </w:numPr>
+        <w:rPr>
+          <w:lang w:val="vi-VN"/>
+        </w:rPr>
+      </w:pPr>
+      <w:r>
+        <w:t>Self-Assessment</w:t>
+      </w:r>
+    </w:p>
+    <w:p>
+      <w:pPr>
+        <w:ind w:firstLine="357"/>
+        <w:rPr>
+          <w:lang w:val="vi-VN"/>
+        </w:rPr>
+      </w:pPr>
+      <w:r>
+        <w:t>During this project, I was mainly responsible for implementing and testing the RDT-related components. I worked on the required functions, checked the correctness of packet/header processing, and fixed issues that appeared during testing.</w:t>
+      </w:r>
+    </w:p>
+    <w:p>
+      <w:pPr>
+        <w:ind w:firstLine="357"/>
+        <w:rPr>
+          <w:lang w:val="vi-VN"/>
+        </w:rPr>
+      </w:pPr>
+      <w:r>
+        <w:t>One important part of my work was debugging the RDT tests. For example, I encountered an issue related to the verification checksum of a serialized header. I reviewed the implementation, corrected the problem, and reran the test until the RdtTest passed successfully. This process helped me better understand how reliable data transfer works and how important careful serialization, checksum handling, and testing are in network programming.</w:t>
+      </w:r>
+    </w:p>
+    <w:p>
+      <w:pPr>
+        <w:ind w:firstLine="357"/>
+        <w:rPr>
+          <w:lang w:val="vi-VN"/>
+        </w:rPr>
+      </w:pPr>
+      <w:r>
+        <w:t>I also worked to make sure that my implementation could integrate correctly with the other parts of the client-server system. Throughout the project, I improved my C++ programming, debugging, testing, and problem-solving skills. I also became more familiar with working in a team where different members are responsible for different components of the same system.</w:t>
+      </w:r>
+    </w:p>
+    <w:p>
+      <w:pPr>
+        <w:ind w:firstLine="357"/>
+        <w:rPr>
+          <w:lang w:val="vi-VN"/>
+        </w:rPr>
+      </w:pPr>
+      <w:r>
+        <w:t>Overall, I believe I completed my assigned tasks successfully and made a meaningful contribution to the project. However, I could still improve by documenting my code more clearly, planning the implementation before coding, and communicating progress and technical issues with the team more frequently.</w:t>
+      </w:r>
+    </w:p>
+    <w:p>
+      <w:pPr>
+        <w:pStyle w:val="Heading3"/>
+        <w:numPr>
+          <w:ilvl w:val="2"/>
+          <w:numId w:val="1"/>
+        </w:numPr>
+        <w:rPr>
+          <w:lang w:val="vi-VN"/>
+        </w:rPr>
+      </w:pPr>
+      <w:r>
+        <w:t>Peer Evaluation</w:t>
+      </w:r>
+    </w:p>
+    <w:p>
+      <w:pPr>
+        <w:ind w:firstLine="357"/>
+        <w:rPr>
+          <w:lang w:val="vi-VN"/>
+        </w:rPr>
+      </w:pPr>
+      <w:r>
+        <w:t>My team members were responsible for different components of the client-server system, and each member contributed to the overall development of the project. We divided the work so that different parts could be developed in parallel while still being integrated into one complete system.</w:t>
+      </w:r>
+    </w:p>
+    <w:p>
+      <w:pPr>
+        <w:ind w:firstLine="357"/>
+        <w:rPr>
+          <w:lang w:val="vi-VN"/>
+        </w:rPr>
+      </w:pPr>
+      <w:r>
+        <w:t>The team was supportive when technical problems occurred, especially when one component depended on another member's implementation. We communicated about requirements, interfaces, testing, and integration to reduce conflicts between different parts of the project.</w:t>
+      </w:r>
+    </w:p>
+    <w:p>
+      <w:pPr>
+        <w:ind w:firstLine="357"/>
+      </w:pPr>
+      <w:r>
+        <w:t>Overall, I think the team worked effectively and each member contributed to the project. The cooperation between members helped us solve implementation and integration problems more efficiently. For future projects, we could improve by having more frequent progress updates, clearer documentation of interfaces and requirements, and earlier integration testing between components.</w:t>
+      </w:r>
+    </w:p>
+    <w:p>
+      <w:pPr>
+        <w:rPr>
+          <w:lang w:val="vi-VN"/>
+        </w:rPr>
+      </w:pPr>
+    </w:p>
+    <w:p>
+      <w:pPr>
         <w:pStyle w:val="Heading2"/>
         <w:numPr>
           <w:ilvl w:val="1"/>
@@ -18806,6 +18774,7 @@
         <w:rPr>
           <w:lang w:val="vi-VN"/>
         </w:rPr>
+        <w:lastRenderedPageBreak/>
         <w:t>Đỗ Minh Khang</w:t>
       </w:r>
       <w:bookmarkEnd w:id="38"/>
@@ -18933,11 +18902,7 @@
         </w:rPr>
       </w:pPr>
       <w:r>
-        <w:t xml:space="preserve">However, there are areas where his workflow could be improved. He frequently accumulated substantial changes and submitted them shortly before deadlines instead of committing smaller, incremental updates throughout the development process. This practice made it more difficult to </w:t>
-      </w:r>
-      <w:r>
-        <w:lastRenderedPageBreak/>
-        <w:t>review and integrate his work. In addition, his enthusiasm sometimes led him to work beyond his assigned responsibilities by implementing features or modifications in other areas of the project. While these contributions were made with good intentions, they occasionally created uncertainty regarding task ownership and project coordination. Maintaining clearer boundaries while continuing to support the team would further improve collaboration in future projects.</w:t>
+        <w:t>However, there are areas where his workflow could be improved. He frequently accumulated substantial changes and submitted them shortly before deadlines instead of committing smaller, incremental updates throughout the development process. This practice made it more difficult to review and integrate his work. In addition, his enthusiasm sometimes led him to work beyond his assigned responsibilities by implementing features or modifications in other areas of the project. While these contributions were made with good intentions, they occasionally created uncertainty regarding task ownership and project coordination. Maintaining clearer boundaries while continuing to support the team would further improve collaboration in future projects.</w:t>
       </w:r>
     </w:p>
     <w:p>
@@ -19318,7 +19283,45 @@
         <w:rPr>
           <w:lang w:val="vi-VN"/>
         </w:rPr>
-        <w:t xml:space="preserve">See at: </w:t>
+        <w:t xml:space="preserve">Mai Phúc Hưng’s log: </w:t>
+      </w:r>
+    </w:p>
+    <w:p>
+      <w:pPr>
+        <w:rPr>
+          <w:lang w:val="vi-VN"/>
+        </w:rPr>
+      </w:pPr>
+      <w:r>
+        <w:rPr>
+          <w:lang w:val="vi-VN"/>
+        </w:rPr>
+        <w:t>Lâm Hồng Hải Hoàng Lê’s log:</w:t>
+      </w:r>
+      <w:r>
+        <w:rPr>
+          <w:lang w:val="vi-VN"/>
+        </w:rPr>
+        <w:t xml:space="preserve"> </w:t>
+      </w:r>
+    </w:p>
+    <w:p>
+      <w:pPr>
+        <w:rPr>
+          <w:lang w:val="vi-VN"/>
+        </w:rPr>
+      </w:pPr>
+      <w:r>
+        <w:rPr>
+          <w:lang w:val="vi-VN"/>
+        </w:rPr>
+        <w:t>Đỗ Minh Khang’s log:</w:t>
+      </w:r>
+      <w:r>
+        <w:rPr>
+          <w:lang w:val="vi-VN"/>
+        </w:rPr>
+        <w:t xml:space="preserve"> </w:t>
       </w:r>
     </w:p>
     <w:p>

</xml_diff>

<commit_message>
docs: update report with evaluation, alongside demo screenshots
</commit_message>
<xml_diff>
--- a/docs/report.docx
+++ b/docs/report.docx
@@ -3750,7 +3750,25 @@
           <w:kern w:val="0"/>
           <w14:ligatures w14:val="none"/>
         </w:rPr>
-        <w:t xml:space="preserve"> an interactive command-line client that connects to the server's control port, issues FTP-style commands, and drives file transfers over a separately-established UDP data channel.</w:t>
+        <w:t xml:space="preserve"> an interactive command-line client that connects to the server's control port, issues FTP-style </w:t>
+      </w:r>
+      <w:proofErr w:type="gramStart"/>
+      <w:r>
+        <w:rPr>
+          <w:rFonts w:eastAsia="Times New Roman" w:cs="Times New Roman"/>
+          <w:kern w:val="0"/>
+          <w14:ligatures w14:val="none"/>
+        </w:rPr>
+        <w:t>commands, and</w:t>
+      </w:r>
+      <w:proofErr w:type="gramEnd"/>
+      <w:r>
+        <w:rPr>
+          <w:rFonts w:eastAsia="Times New Roman" w:cs="Times New Roman"/>
+          <w:kern w:val="0"/>
+          <w14:ligatures w14:val="none"/>
+        </w:rPr>
+        <w:t xml:space="preserve"> drives file transfers over a separately-established UDP data channel.</w:t>
       </w:r>
     </w:p>
     <w:p>
@@ -4358,11 +4376,19 @@
         </w:rPr>
         <w:t>/</w:t>
       </w:r>
+      <w:proofErr w:type="gramStart"/>
       <w:r>
         <w:rPr>
           <w:rStyle w:val="PseudocodeChar"/>
         </w:rPr>
-        <w:t>accept()</w:t>
+        <w:t>accept(</w:t>
+      </w:r>
+      <w:proofErr w:type="gramEnd"/>
+      <w:r>
+        <w:rPr>
+          <w:rStyle w:val="PseudocodeChar"/>
+        </w:rPr>
+        <w:t>)</w:t>
       </w:r>
       <w:r>
         <w:rPr>
@@ -4454,8 +4480,13 @@
         </w:rPr>
         <w:t>” r</w:t>
       </w:r>
-      <w:r>
-        <w:t xml:space="preserve">eply. The client sends </w:t>
+      <w:proofErr w:type="spellStart"/>
+      <w:r>
+        <w:t>eply</w:t>
+      </w:r>
+      <w:proofErr w:type="spellEnd"/>
+      <w:r>
+        <w:t xml:space="preserve">. The client sends </w:t>
       </w:r>
       <w:r>
         <w:rPr>
@@ -4541,8 +4572,13 @@
         </w:rPr>
         <w:t>” o</w:t>
       </w:r>
-      <w:r>
-        <w:t xml:space="preserve">therwise. Every command other than </w:t>
+      <w:proofErr w:type="spellStart"/>
+      <w:r>
+        <w:t>therwise</w:t>
+      </w:r>
+      <w:proofErr w:type="spellEnd"/>
+      <w:r>
+        <w:t xml:space="preserve">. Every command other than </w:t>
       </w:r>
       <w:r>
         <w:rPr>
@@ -4589,11 +4625,21 @@
       <w:r>
         <w:t xml:space="preserve"> is gated behind </w:t>
       </w:r>
+      <w:proofErr w:type="spellStart"/>
+      <w:proofErr w:type="gramStart"/>
       <w:r>
         <w:rPr>
           <w:rStyle w:val="PseudocodeChar"/>
         </w:rPr>
-        <w:t>s.authenticated == true</w:t>
+        <w:t>s.authenticated</w:t>
+      </w:r>
+      <w:proofErr w:type="spellEnd"/>
+      <w:proofErr w:type="gramEnd"/>
+      <w:r>
+        <w:rPr>
+          <w:rStyle w:val="PseudocodeChar"/>
+        </w:rPr>
+        <w:t xml:space="preserve"> == true</w:t>
       </w:r>
       <w:r>
         <w:t>, so an unauthenticated client cannot issue file or directory operations.</w:t>
@@ -4793,7 +4839,25 @@
           <w:kern w:val="0"/>
           <w14:ligatures w14:val="none"/>
         </w:rPr>
-        <w:t>At this point the session branches depending on which data-channel mode the client selects for its next transfer.</w:t>
+        <w:t xml:space="preserve">At this point the </w:t>
+      </w:r>
+      <w:proofErr w:type="gramStart"/>
+      <w:r>
+        <w:rPr>
+          <w:rFonts w:eastAsia="Times New Roman" w:cs="Times New Roman"/>
+          <w:kern w:val="0"/>
+          <w14:ligatures w14:val="none"/>
+        </w:rPr>
+        <w:t>session branches</w:t>
+      </w:r>
+      <w:proofErr w:type="gramEnd"/>
+      <w:r>
+        <w:rPr>
+          <w:rFonts w:eastAsia="Times New Roman" w:cs="Times New Roman"/>
+          <w:kern w:val="0"/>
+          <w14:ligatures w14:val="none"/>
+        </w:rPr>
+        <w:t xml:space="preserve"> depending on which data-channel mode the client selects for its next transfer.</w:t>
       </w:r>
     </w:p>
     <w:p>
@@ -4961,7 +5025,21 @@
         <w:rPr>
           <w:rStyle w:val="PseudocodeChar"/>
         </w:rPr>
-        <w:t>227 Entering Passive Mode (h1,h2,h3,h4,p1,p2)</w:t>
+        <w:t>227 Entering Passive Mode (h</w:t>
+      </w:r>
+      <w:proofErr w:type="gramStart"/>
+      <w:r>
+        <w:rPr>
+          <w:rStyle w:val="PseudocodeChar"/>
+        </w:rPr>
+        <w:t>1,h2,h3,h4,p1,p</w:t>
+      </w:r>
+      <w:proofErr w:type="gramEnd"/>
+      <w:r>
+        <w:rPr>
+          <w:rStyle w:val="PseudocodeChar"/>
+        </w:rPr>
+        <w:t>2)</w:t>
       </w:r>
       <w:r>
         <w:rPr>
@@ -4978,7 +5056,25 @@
           <w:kern w:val="0"/>
           <w14:ligatures w14:val="none"/>
         </w:rPr>
-        <w:t>, encoding its own IP and the chosen port. This socket is kept open and reused directly by the RDT transport rather than being closed and re-opened later.</w:t>
+        <w:t xml:space="preserve">, encoding its own IP and the chosen port. This socket is kept open and reused directly by </w:t>
+      </w:r>
+      <w:proofErr w:type="gramStart"/>
+      <w:r>
+        <w:rPr>
+          <w:rFonts w:eastAsia="Times New Roman" w:cs="Times New Roman"/>
+          <w:kern w:val="0"/>
+          <w14:ligatures w14:val="none"/>
+        </w:rPr>
+        <w:t>the RDT</w:t>
+      </w:r>
+      <w:proofErr w:type="gramEnd"/>
+      <w:r>
+        <w:rPr>
+          <w:rFonts w:eastAsia="Times New Roman" w:cs="Times New Roman"/>
+          <w:kern w:val="0"/>
+          <w14:ligatures w14:val="none"/>
+        </w:rPr>
+        <w:t xml:space="preserve"> transport rather than being closed and re-opened later.</w:t>
       </w:r>
     </w:p>
     <w:p>
@@ -5220,11 +5316,27 @@
         </w:rPr>
         <w:t xml:space="preserve"> packets immediately; the server's receiver learns the client's address naturally from the first packet it receives via </w:t>
       </w:r>
+      <w:proofErr w:type="spellStart"/>
+      <w:proofErr w:type="gramStart"/>
       <w:r>
         <w:rPr>
           <w:rStyle w:val="PseudocodeChar"/>
         </w:rPr>
-        <w:t>recvfrom()</w:t>
+        <w:t>recvfrom</w:t>
+      </w:r>
+      <w:proofErr w:type="spellEnd"/>
+      <w:r>
+        <w:rPr>
+          <w:rStyle w:val="PseudocodeChar"/>
+        </w:rPr>
+        <w:t>(</w:t>
+      </w:r>
+      <w:proofErr w:type="gramEnd"/>
+      <w:r>
+        <w:rPr>
+          <w:rStyle w:val="PseudocodeChar"/>
+        </w:rPr>
+        <w:t>)</w:t>
       </w:r>
       <w:r>
         <w:rPr>
@@ -5302,23 +5414,25 @@
           <w:kern w:val="0"/>
           <w14:ligatures w14:val="none"/>
         </w:rPr>
-        <w:t xml:space="preserve"> The file is read in fixed-size chunks and sent as a sequence of UDP packets, each carrying a sequence number, flags, and a 16-bit checksum. The sender maintains a sliding window (Selective Repeat), retransmitting any packet whose acknowledgment is not received within a dynamically-estimated timeout (derived from measured RTT). The receiver acknowledges every valid packet it receives </w:t>
-      </w:r>
+        <w:t xml:space="preserve"> The file is read in fixed-size chunks and sent as a sequence of UDP packets, each carrying a sequence number, flags, and a 16-bit checksum. The sender maintains a sliding window (Selective Repeat), retransmitting any packet whose acknowledgment is not received within a </w:t>
+      </w:r>
+      <w:proofErr w:type="gramStart"/>
       <w:r>
         <w:rPr>
           <w:rFonts w:eastAsia="Times New Roman" w:cs="Times New Roman"/>
           <w:kern w:val="0"/>
           <w14:ligatures w14:val="none"/>
         </w:rPr>
-        <w:t>–</w:t>
-      </w:r>
+        <w:t>dynamically-estimated</w:t>
+      </w:r>
+      <w:proofErr w:type="gramEnd"/>
       <w:r>
         <w:rPr>
           <w:rFonts w:eastAsia="Times New Roman" w:cs="Times New Roman"/>
           <w:kern w:val="0"/>
           <w14:ligatures w14:val="none"/>
         </w:rPr>
-        <w:t xml:space="preserve"> including duplicates </w:t>
+        <w:t xml:space="preserve"> timeout (derived from measured RTT). The receiver acknowledges every valid packet it receives </w:t>
       </w:r>
       <w:r>
         <w:rPr>
@@ -5334,13 +5448,7 @@
           <w:kern w:val="0"/>
           <w14:ligatures w14:val="none"/>
         </w:rPr>
-        <w:t xml:space="preserve"> and silently discards any packet that fails its checksum. The final chunk is marked with an explicit </w:t>
-      </w:r>
-      <w:r>
-        <w:rPr>
-          <w:rStyle w:val="PseudocodeChar"/>
-        </w:rPr>
-        <w:t>FLAG_FIN</w:t>
+        <w:t xml:space="preserve"> including duplicates </w:t>
       </w:r>
       <w:r>
         <w:rPr>
@@ -5348,7 +5456,65 @@
           <w:kern w:val="0"/>
           <w14:ligatures w14:val="none"/>
         </w:rPr>
-        <w:t xml:space="preserve"> flag so the receiver knows to stop and finalize the file.</w:t>
+        <w:t>–</w:t>
+      </w:r>
+      <w:r>
+        <w:rPr>
+          <w:rFonts w:eastAsia="Times New Roman" w:cs="Times New Roman"/>
+          <w:kern w:val="0"/>
+          <w14:ligatures w14:val="none"/>
+        </w:rPr>
+        <w:t xml:space="preserve"> and silently discards any packet that fails its checksum. The final chunk is marked with an explicit </w:t>
+      </w:r>
+      <w:r>
+        <w:rPr>
+          <w:rStyle w:val="PseudocodeChar"/>
+        </w:rPr>
+        <w:t>FLAG_FIN</w:t>
+      </w:r>
+      <w:r>
+        <w:rPr>
+          <w:rFonts w:eastAsia="Times New Roman" w:cs="Times New Roman"/>
+          <w:kern w:val="0"/>
+          <w14:ligatures w14:val="none"/>
+        </w:rPr>
+        <w:t xml:space="preserve"> </w:t>
+      </w:r>
+      <w:proofErr w:type="gramStart"/>
+      <w:r>
+        <w:rPr>
+          <w:rFonts w:eastAsia="Times New Roman" w:cs="Times New Roman"/>
+          <w:kern w:val="0"/>
+          <w14:ligatures w14:val="none"/>
+        </w:rPr>
+        <w:t>flag</w:t>
+      </w:r>
+      <w:proofErr w:type="gramEnd"/>
+      <w:r>
+        <w:rPr>
+          <w:rFonts w:eastAsia="Times New Roman" w:cs="Times New Roman"/>
+          <w:kern w:val="0"/>
+          <w14:ligatures w14:val="none"/>
+        </w:rPr>
+        <w:t xml:space="preserve"> so the receiver </w:t>
+      </w:r>
+      <w:proofErr w:type="gramStart"/>
+      <w:r>
+        <w:rPr>
+          <w:rFonts w:eastAsia="Times New Roman" w:cs="Times New Roman"/>
+          <w:kern w:val="0"/>
+          <w14:ligatures w14:val="none"/>
+        </w:rPr>
+        <w:t>knows</w:t>
+      </w:r>
+      <w:proofErr w:type="gramEnd"/>
+      <w:r>
+        <w:rPr>
+          <w:rFonts w:eastAsia="Times New Roman" w:cs="Times New Roman"/>
+          <w:kern w:val="0"/>
+          <w14:ligatures w14:val="none"/>
+        </w:rPr>
+        <w:t xml:space="preserve"> to stop and finalize the file.</w:t>
       </w:r>
     </w:p>
     <w:p>
@@ -5853,7 +6019,21 @@
         <w:rPr>
           <w:rStyle w:val="PseudocodeChar"/>
         </w:rPr>
-        <w:t>PORT h1,h2,h3,h4,p1,p2</w:t>
+        <w:t>PORT h</w:t>
+      </w:r>
+      <w:proofErr w:type="gramStart"/>
+      <w:r>
+        <w:rPr>
+          <w:rStyle w:val="PseudocodeChar"/>
+        </w:rPr>
+        <w:t>1,h2,h3,h4,p1,p</w:t>
+      </w:r>
+      <w:proofErr w:type="gramEnd"/>
+      <w:r>
+        <w:rPr>
+          <w:rStyle w:val="PseudocodeChar"/>
+        </w:rPr>
+        <w:t>2</w:t>
       </w:r>
       <w:r>
         <w:rPr>
@@ -5864,13 +6044,23 @@
         </w:rPr>
         <w:t>” a</w:t>
       </w:r>
+      <w:proofErr w:type="spellStart"/>
       <w:r>
         <w:rPr>
           <w:rFonts w:eastAsia="Times New Roman" w:cs="Times New Roman"/>
           <w:kern w:val="0"/>
           <w14:ligatures w14:val="none"/>
         </w:rPr>
-        <w:t xml:space="preserve">dvertising that address. The server replies </w:t>
+        <w:t>dvertising</w:t>
+      </w:r>
+      <w:proofErr w:type="spellEnd"/>
+      <w:r>
+        <w:rPr>
+          <w:rFonts w:eastAsia="Times New Roman" w:cs="Times New Roman"/>
+          <w:kern w:val="0"/>
+          <w14:ligatures w14:val="none"/>
+        </w:rPr>
+        <w:t xml:space="preserve"> that address. The server replies </w:t>
       </w:r>
       <w:r>
         <w:rPr>
@@ -6162,7 +6352,25 @@
           <w:kern w:val="0"/>
           <w14:ligatures w14:val="none"/>
         </w:rPr>
-        <w:t>-advertised address before expecting any data. The client, already bound and listening on that address, receives the SYN and begins sending file data in response.</w:t>
+        <w:t xml:space="preserve">-advertised address before expecting any data. The client, already bound and listening </w:t>
+      </w:r>
+      <w:proofErr w:type="gramStart"/>
+      <w:r>
+        <w:rPr>
+          <w:rFonts w:eastAsia="Times New Roman" w:cs="Times New Roman"/>
+          <w:kern w:val="0"/>
+          <w14:ligatures w14:val="none"/>
+        </w:rPr>
+        <w:t>on</w:t>
+      </w:r>
+      <w:proofErr w:type="gramEnd"/>
+      <w:r>
+        <w:rPr>
+          <w:rFonts w:eastAsia="Times New Roman" w:cs="Times New Roman"/>
+          <w:kern w:val="0"/>
+          <w14:ligatures w14:val="none"/>
+        </w:rPr>
+        <w:t xml:space="preserve"> that address, receives the SYN and begins sending file data in response.</w:t>
       </w:r>
     </w:p>
     <w:p>
@@ -6203,7 +6411,15 @@
         <w:t>P</w:t>
       </w:r>
       <w:r>
-        <w:t>roceed identically to the Passive-mode case (reliable windowed transfer, hash-verified completion, session termination).</w:t>
+        <w:t>roceed identically to the Passive-mode case (</w:t>
+      </w:r>
+      <w:proofErr w:type="gramStart"/>
+      <w:r>
+        <w:t>reliable windowed</w:t>
+      </w:r>
+      <w:proofErr w:type="gramEnd"/>
+      <w:r>
+        <w:t xml:space="preserve"> transfer, hash-verified completion, session termination).</w:t>
       </w:r>
     </w:p>
     <w:p>
@@ -6352,7 +6568,15 @@
         </w:rPr>
       </w:pPr>
       <w:r>
-        <w:t xml:space="preserve">Three further commands extend the transfer lifecycle described in 1.2.1/1.2.2, and one changes its execution </w:t>
+        <w:t xml:space="preserve">Three further commands extend the transfer lifecycle described </w:t>
+      </w:r>
+      <w:proofErr w:type="gramStart"/>
+      <w:r>
+        <w:t>in</w:t>
+      </w:r>
+      <w:proofErr w:type="gramEnd"/>
+      <w:r>
+        <w:t xml:space="preserve"> 1.2.1/1.2.2, and one changes its execution </w:t>
       </w:r>
       <w:r>
         <w:t>model</w:t>
@@ -6532,7 +6756,15 @@
         <w:t>STOR</w:t>
       </w:r>
       <w:r>
-        <w:t xml:space="preserve"> up through the point where the new data has been fully and correctly received into a staging area; only once that succeeds does the server combine the newly-received data with any existing file at the destination (or simply use it as-is if the destination doesn't yet exist), committing the combined result atomically. A failed or aborted </w:t>
+        <w:t xml:space="preserve"> up through the point where the new data has been fully and correctly received into a staging area; only once that succeeds does the server combine the </w:t>
+      </w:r>
+      <w:proofErr w:type="gramStart"/>
+      <w:r>
+        <w:t>newly-received</w:t>
+      </w:r>
+      <w:proofErr w:type="gramEnd"/>
+      <w:r>
+        <w:t xml:space="preserve"> data with any existing file at the destination (or simply use it as-is if the destination doesn't yet exist), committing the combined result atomically. A failed or aborted </w:t>
       </w:r>
       <w:r>
         <w:rPr>
@@ -6627,8 +6859,29 @@
         </w:rPr>
         <w:t xml:space="preserve"> by </w:t>
       </w:r>
-      <w:r>
-        <w:t>sets a shared, thread-safe flag and then blocks until the worker thread confirms it has actually stopped before replying, giving the client a verified c</w:t>
+      <w:proofErr w:type="gramStart"/>
+      <w:r>
+        <w:t>sets</w:t>
+      </w:r>
+      <w:proofErr w:type="gramEnd"/>
+      <w:r>
+        <w:t xml:space="preserve"> a shared, thread-safe flag and then </w:t>
+      </w:r>
+      <w:proofErr w:type="gramStart"/>
+      <w:r>
+        <w:t>blocks</w:t>
+      </w:r>
+      <w:proofErr w:type="gramEnd"/>
+      <w:r>
+        <w:t xml:space="preserve"> until the worker thread confirms it has </w:t>
+      </w:r>
+      <w:proofErr w:type="gramStart"/>
+      <w:r>
+        <w:t>actually stopped</w:t>
+      </w:r>
+      <w:proofErr w:type="gramEnd"/>
+      <w:r>
+        <w:t xml:space="preserve"> before replying, giving the client a verified c</w:t>
       </w:r>
       <w:r>
         <w:t>ancellation</w:t>
@@ -6925,21 +7178,41 @@
       <w:r>
         <w:t xml:space="preserve">Parsed server-side by </w:t>
       </w:r>
+      <w:proofErr w:type="spellStart"/>
+      <w:proofErr w:type="gramStart"/>
       <w:r>
         <w:rPr>
           <w:rStyle w:val="PseudocodeChar"/>
         </w:rPr>
-        <w:t>CommandParser::parseCommand</w:t>
-      </w:r>
+        <w:t>CommandParser</w:t>
+      </w:r>
+      <w:proofErr w:type="spellEnd"/>
+      <w:r>
+        <w:rPr>
+          <w:rStyle w:val="PseudocodeChar"/>
+        </w:rPr>
+        <w:t>::</w:t>
+      </w:r>
+      <w:proofErr w:type="spellStart"/>
+      <w:proofErr w:type="gramEnd"/>
+      <w:r>
+        <w:rPr>
+          <w:rStyle w:val="PseudocodeChar"/>
+        </w:rPr>
+        <w:t>parseCommand</w:t>
+      </w:r>
+      <w:proofErr w:type="spellEnd"/>
       <w:r>
         <w:t xml:space="preserve">, which splits the line into a </w:t>
       </w:r>
+      <w:proofErr w:type="spellStart"/>
       <w:r>
         <w:rPr>
           <w:rStyle w:val="PseudocodeChar"/>
         </w:rPr>
         <w:t>ParsedCommand</w:t>
       </w:r>
+      <w:proofErr w:type="spellEnd"/>
       <w:r>
         <w:t xml:space="preserve"> structure:</w:t>
       </w:r>
@@ -7026,6 +7299,7 @@
                 <w:lang w:val="vi-VN"/>
               </w:rPr>
             </w:pPr>
+            <w:proofErr w:type="spellStart"/>
             <w:r>
               <w:rPr>
                 <w:b w:val="0"/>
@@ -7033,6 +7307,7 @@
               </w:rPr>
               <w:t>rawCommand</w:t>
             </w:r>
+            <w:proofErr w:type="spellEnd"/>
           </w:p>
         </w:tc>
         <w:tc>
@@ -7047,8 +7322,13 @@
                 <w:lang w:val="vi-VN"/>
               </w:rPr>
             </w:pPr>
-            <w:r>
-              <w:t>std::string</w:t>
+            <w:proofErr w:type="gramStart"/>
+            <w:r>
+              <w:t>std::</w:t>
+            </w:r>
+            <w:proofErr w:type="gramEnd"/>
+            <w:r>
+              <w:t>string</w:t>
             </w:r>
           </w:p>
         </w:tc>
@@ -7105,8 +7385,13 @@
                 <w:lang w:val="vi-VN"/>
               </w:rPr>
             </w:pPr>
-            <w:r>
-              <w:t>std::string</w:t>
+            <w:proofErr w:type="gramStart"/>
+            <w:r>
+              <w:t>std::</w:t>
+            </w:r>
+            <w:proofErr w:type="gramEnd"/>
+            <w:r>
+              <w:t>string</w:t>
             </w:r>
           </w:p>
         </w:tc>
@@ -7154,6 +7439,7 @@
                 <w:lang w:val="vi-VN"/>
               </w:rPr>
             </w:pPr>
+            <w:proofErr w:type="spellStart"/>
             <w:r>
               <w:rPr>
                 <w:b w:val="0"/>
@@ -7161,6 +7447,7 @@
               </w:rPr>
               <w:t>args</w:t>
             </w:r>
+            <w:proofErr w:type="spellEnd"/>
           </w:p>
         </w:tc>
         <w:tc>
@@ -7175,8 +7462,13 @@
                 <w:lang w:val="vi-VN"/>
               </w:rPr>
             </w:pPr>
-            <w:r>
-              <w:t>std::string</w:t>
+            <w:proofErr w:type="gramStart"/>
+            <w:r>
+              <w:t>std::</w:t>
+            </w:r>
+            <w:proofErr w:type="gramEnd"/>
+            <w:r>
+              <w:t>string</w:t>
             </w:r>
           </w:p>
         </w:tc>
@@ -7282,11 +7574,55 @@
           <w:lang w:val="vi-VN"/>
         </w:rPr>
       </w:pPr>
+      <w:proofErr w:type="gramStart"/>
       <w:r>
         <w:rPr>
           <w:rStyle w:val="PseudocodeChar"/>
         </w:rPr>
-        <w:t>std::to_string(replyCode) + " " + message + "\r\n"</w:t>
+        <w:t>std::</w:t>
+      </w:r>
+      <w:proofErr w:type="spellStart"/>
+      <w:proofErr w:type="gramEnd"/>
+      <w:r>
+        <w:rPr>
+          <w:rStyle w:val="PseudocodeChar"/>
+        </w:rPr>
+        <w:t>to_string</w:t>
+      </w:r>
+      <w:proofErr w:type="spellEnd"/>
+      <w:r>
+        <w:rPr>
+          <w:rStyle w:val="PseudocodeChar"/>
+        </w:rPr>
+        <w:t>(</w:t>
+      </w:r>
+      <w:proofErr w:type="spellStart"/>
+      <w:r>
+        <w:rPr>
+          <w:rStyle w:val="PseudocodeChar"/>
+        </w:rPr>
+        <w:t>replyCode</w:t>
+      </w:r>
+      <w:proofErr w:type="spellEnd"/>
+      <w:r>
+        <w:rPr>
+          <w:rStyle w:val="PseudocodeChar"/>
+        </w:rPr>
+        <w:t xml:space="preserve">) </w:t>
+      </w:r>
+      <w:proofErr w:type="gramStart"/>
+      <w:r>
+        <w:rPr>
+          <w:rStyle w:val="PseudocodeChar"/>
+        </w:rPr>
+        <w:t>+ " "</w:t>
+      </w:r>
+      <w:proofErr w:type="gramEnd"/>
+      <w:r>
+        <w:rPr>
+          <w:rStyle w:val="PseudocodeChar"/>
+        </w:rPr>
+        <w:t xml:space="preserve"> + message + "\r\n"</w:t>
       </w:r>
     </w:p>
     <w:p>
@@ -7650,9 +7986,11 @@
                 <w:lang w:val="vi-VN"/>
               </w:rPr>
             </w:pPr>
+            <w:proofErr w:type="spellStart"/>
             <w:r>
               <w:t>seq_num</w:t>
             </w:r>
+            <w:proofErr w:type="spellEnd"/>
           </w:p>
         </w:tc>
         <w:tc>
@@ -7770,9 +8108,11 @@
                 <w:lang w:val="vi-VN"/>
               </w:rPr>
             </w:pPr>
+            <w:proofErr w:type="spellStart"/>
             <w:r>
               <w:t>ack_num</w:t>
             </w:r>
+            <w:proofErr w:type="spellEnd"/>
           </w:p>
         </w:tc>
         <w:tc>
@@ -7987,9 +8327,11 @@
                 <w:lang w:val="vi-VN"/>
               </w:rPr>
             </w:pPr>
+            <w:proofErr w:type="spellStart"/>
             <w:r>
               <w:t>window_size</w:t>
             </w:r>
+            <w:proofErr w:type="spellEnd"/>
           </w:p>
         </w:tc>
         <w:tc>
@@ -8110,9 +8452,11 @@
                 <w:lang w:val="vi-VN"/>
               </w:rPr>
             </w:pPr>
+            <w:proofErr w:type="spellStart"/>
             <w:r>
               <w:t>payload_len</w:t>
             </w:r>
+            <w:proofErr w:type="spellEnd"/>
           </w:p>
         </w:tc>
         <w:tc>
@@ -9158,6 +9502,7 @@
           <w:lang w:val="vi-VN"/>
         </w:rPr>
       </w:pPr>
+      <w:proofErr w:type="spellStart"/>
       <w:r>
         <w:rPr>
           <w:rStyle w:val="PseudocodeChar"/>
@@ -9166,6 +9511,7 @@
         </w:rPr>
         <w:t>RdtPacket</w:t>
       </w:r>
+      <w:proofErr w:type="spellEnd"/>
       <w:r>
         <w:rPr>
           <w:sz w:val="36"/>
@@ -9194,7 +9540,15 @@
         </w:rPr>
       </w:pPr>
       <w:r>
-        <w:t>struct RdtPacket {</w:t>
+        <w:t xml:space="preserve">struct </w:t>
+      </w:r>
+      <w:proofErr w:type="spellStart"/>
+      <w:r>
+        <w:t>RdtPacket</w:t>
+      </w:r>
+      <w:proofErr w:type="spellEnd"/>
+      <w:r>
+        <w:t xml:space="preserve"> {</w:t>
       </w:r>
     </w:p>
     <w:p>
@@ -9208,8 +9562,13 @@
           <w:lang w:val="vi-VN"/>
         </w:rPr>
       </w:pPr>
-      <w:r>
-        <w:t xml:space="preserve">RdtHeader header; </w:t>
+      <w:proofErr w:type="spellStart"/>
+      <w:r>
+        <w:t>RdtHeader</w:t>
+      </w:r>
+      <w:proofErr w:type="spellEnd"/>
+      <w:r>
+        <w:t xml:space="preserve"> header; </w:t>
       </w:r>
       <w:r>
         <w:rPr>
@@ -9239,7 +9598,15 @@
         </w:rPr>
       </w:pPr>
       <w:r>
-        <w:t xml:space="preserve">char payload[MAX_PAYLOAD]; // 1024 bytes </w:t>
+        <w:t xml:space="preserve">char </w:t>
+      </w:r>
+      <w:proofErr w:type="gramStart"/>
+      <w:r>
+        <w:t>payload[</w:t>
+      </w:r>
+      <w:proofErr w:type="gramEnd"/>
+      <w:r>
+        <w:t xml:space="preserve">MAX_PAYLOAD]; // 1024 bytes </w:t>
       </w:r>
     </w:p>
     <w:p>
@@ -9333,8 +9700,16 @@
         <w:rPr>
           <w:rStyle w:val="PseudocodeChar"/>
         </w:rPr>
-        <w:t>shared/protocol/ProtocolConstants.h</w:t>
-      </w:r>
+        <w:t>shared/protocol/</w:t>
+      </w:r>
+      <w:proofErr w:type="spellStart"/>
+      <w:r>
+        <w:rPr>
+          <w:rStyle w:val="PseudocodeChar"/>
+        </w:rPr>
+        <w:t>ProtocolConstants.h</w:t>
+      </w:r>
+      <w:proofErr w:type="spellEnd"/>
     </w:p>
     <w:tbl>
       <w:tblPr>
@@ -9581,7 +9956,15 @@
               </w:rPr>
             </w:pPr>
             <w:r>
-              <w:t>Maximum handshake retry attempts before aborting</w:t>
+              <w:t xml:space="preserve">Maximum </w:t>
+            </w:r>
+            <w:proofErr w:type="gramStart"/>
+            <w:r>
+              <w:t>handshake</w:t>
+            </w:r>
+            <w:proofErr w:type="gramEnd"/>
+            <w:r>
+              <w:t xml:space="preserve"> retry attempts before aborting</w:t>
             </w:r>
           </w:p>
         </w:tc>
@@ -9699,7 +10082,15 @@
               </w:rPr>
             </w:pPr>
             <w:r>
-              <w:t>Extended idle wait used specifically when chaos-mode fault injection is active</w:t>
+              <w:t xml:space="preserve">Extended idle wait </w:t>
+            </w:r>
+            <w:proofErr w:type="gramStart"/>
+            <w:r>
+              <w:t>used</w:t>
+            </w:r>
+            <w:proofErr w:type="gramEnd"/>
+            <w:r>
+              <w:t xml:space="preserve"> specifically when chaos-mode fault injection is active</w:t>
             </w:r>
           </w:p>
         </w:tc>
@@ -9815,8 +10206,30 @@
         <w:rPr>
           <w:rStyle w:val="PseudocodeChar"/>
         </w:rPr>
-        <w:t>server/src/control/Session.h</w:t>
-      </w:r>
+        <w:t>server/</w:t>
+      </w:r>
+      <w:proofErr w:type="spellStart"/>
+      <w:r>
+        <w:rPr>
+          <w:rStyle w:val="PseudocodeChar"/>
+        </w:rPr>
+        <w:t>src</w:t>
+      </w:r>
+      <w:proofErr w:type="spellEnd"/>
+      <w:r>
+        <w:rPr>
+          <w:rStyle w:val="PseudocodeChar"/>
+        </w:rPr>
+        <w:t>/control/</w:t>
+      </w:r>
+      <w:proofErr w:type="spellStart"/>
+      <w:r>
+        <w:rPr>
+          <w:rStyle w:val="PseudocodeChar"/>
+        </w:rPr>
+        <w:t>Session.h</w:t>
+      </w:r>
+      <w:proofErr w:type="spellEnd"/>
       <w:r>
         <w:rPr>
           <w:lang w:val="vi-VN"/>
@@ -10004,11 +10417,19 @@
             <w:r>
               <w:t xml:space="preserve">Login status, set only after a real credential check against </w:t>
             </w:r>
+            <w:proofErr w:type="gramStart"/>
             <w:r>
               <w:rPr>
                 <w:rStyle w:val="PseudocodeChar"/>
               </w:rPr>
-              <w:t>Users::database</w:t>
+              <w:t>Users::</w:t>
+            </w:r>
+            <w:proofErr w:type="gramEnd"/>
+            <w:r>
+              <w:rPr>
+                <w:rStyle w:val="PseudocodeChar"/>
+              </w:rPr>
+              <w:t>database</w:t>
             </w:r>
           </w:p>
         </w:tc>
@@ -10031,6 +10452,7 @@
                 <w:lang w:val="vi-VN"/>
               </w:rPr>
             </w:pPr>
+            <w:proofErr w:type="spellStart"/>
             <w:r>
               <w:rPr>
                 <w:b w:val="0"/>
@@ -10038,6 +10460,7 @@
               </w:rPr>
               <w:t>transferMode</w:t>
             </w:r>
+            <w:proofErr w:type="spellEnd"/>
           </w:p>
         </w:tc>
         <w:tc>
@@ -10052,9 +10475,11 @@
                 <w:lang w:val="vi-VN"/>
               </w:rPr>
             </w:pPr>
+            <w:proofErr w:type="spellStart"/>
             <w:r>
               <w:t>TransferMode</w:t>
             </w:r>
+            <w:proofErr w:type="spellEnd"/>
           </w:p>
         </w:tc>
         <w:tc>
@@ -10128,8 +10553,13 @@
                 <w:lang w:val="vi-VN"/>
               </w:rPr>
             </w:pPr>
-            <w:r>
-              <w:t>std::string</w:t>
+            <w:proofErr w:type="gramStart"/>
+            <w:r>
+              <w:t>std::</w:t>
+            </w:r>
+            <w:proofErr w:type="gramEnd"/>
+            <w:r>
+              <w:t>string</w:t>
             </w:r>
           </w:p>
         </w:tc>
@@ -10174,6 +10604,7 @@
                 <w:lang w:val="vi-VN"/>
               </w:rPr>
             </w:pPr>
+            <w:proofErr w:type="spellStart"/>
             <w:r>
               <w:rPr>
                 <w:b w:val="0"/>
@@ -10181,6 +10612,7 @@
               </w:rPr>
               <w:t>currentDir</w:t>
             </w:r>
+            <w:proofErr w:type="spellEnd"/>
           </w:p>
         </w:tc>
         <w:tc>
@@ -10195,8 +10627,13 @@
                 <w:lang w:val="vi-VN"/>
               </w:rPr>
             </w:pPr>
-            <w:r>
-              <w:t>std::filesystem::path</w:t>
+            <w:proofErr w:type="gramStart"/>
+            <w:r>
+              <w:t>std::filesystem::</w:t>
+            </w:r>
+            <w:proofErr w:type="gramEnd"/>
+            <w:r>
+              <w:t>path</w:t>
             </w:r>
           </w:p>
         </w:tc>
@@ -10214,12 +10651,14 @@
             <w:r>
               <w:t xml:space="preserve">This session's current working directory, bounded by </w:t>
             </w:r>
+            <w:proofErr w:type="spellStart"/>
             <w:r>
               <w:rPr>
                 <w:rStyle w:val="PseudocodeChar"/>
               </w:rPr>
               <w:t>PathResolver</w:t>
             </w:r>
+            <w:proofErr w:type="spellEnd"/>
           </w:p>
         </w:tc>
       </w:tr>
@@ -10238,6 +10677,7 @@
                 <w:lang w:val="vi-VN"/>
               </w:rPr>
             </w:pPr>
+            <w:proofErr w:type="spellStart"/>
             <w:r>
               <w:rPr>
                 <w:b w:val="0"/>
@@ -10245,6 +10685,7 @@
               </w:rPr>
               <w:t>dataChannelMode</w:t>
             </w:r>
+            <w:proofErr w:type="spellEnd"/>
           </w:p>
         </w:tc>
         <w:tc>
@@ -10259,9 +10700,11 @@
                 <w:lang w:val="vi-VN"/>
               </w:rPr>
             </w:pPr>
+            <w:proofErr w:type="spellStart"/>
             <w:r>
               <w:t>DataChannelMode</w:t>
             </w:r>
+            <w:proofErr w:type="spellEnd"/>
           </w:p>
         </w:tc>
         <w:tc>
@@ -10332,6 +10775,7 @@
                 <w:lang w:val="vi-VN"/>
               </w:rPr>
             </w:pPr>
+            <w:proofErr w:type="spellStart"/>
             <w:r>
               <w:rPr>
                 <w:b w:val="0"/>
@@ -10339,6 +10783,7 @@
               </w:rPr>
               <w:t>pendingDataSocket</w:t>
             </w:r>
+            <w:proofErr w:type="spellEnd"/>
           </w:p>
         </w:tc>
         <w:tc>
@@ -10399,6 +10844,7 @@
                 <w:lang w:val="vi-VN"/>
               </w:rPr>
             </w:pPr>
+            <w:proofErr w:type="spellStart"/>
             <w:r>
               <w:rPr>
                 <w:b w:val="0"/>
@@ -10406,6 +10852,7 @@
               </w:rPr>
               <w:t>pendingPeerAddr</w:t>
             </w:r>
+            <w:proofErr w:type="spellEnd"/>
           </w:p>
         </w:tc>
         <w:tc>
@@ -10420,9 +10867,11 @@
                 <w:lang w:val="vi-VN"/>
               </w:rPr>
             </w:pPr>
+            <w:proofErr w:type="spellStart"/>
             <w:r>
               <w:t>sockaddr_in</w:t>
             </w:r>
+            <w:proofErr w:type="spellEnd"/>
           </w:p>
         </w:tc>
         <w:tc>
@@ -10460,6 +10909,7 @@
                 <w:lang w:val="vi-VN"/>
               </w:rPr>
             </w:pPr>
+            <w:proofErr w:type="spellStart"/>
             <w:r>
               <w:rPr>
                 <w:b w:val="0"/>
@@ -10467,6 +10917,7 @@
               </w:rPr>
               <w:t>controlPeerAddr</w:t>
             </w:r>
+            <w:proofErr w:type="spellEnd"/>
           </w:p>
         </w:tc>
         <w:tc>
@@ -10481,9 +10932,11 @@
                 <w:lang w:val="vi-VN"/>
               </w:rPr>
             </w:pPr>
+            <w:proofErr w:type="spellStart"/>
             <w:r>
               <w:t>sockaddr_in</w:t>
             </w:r>
+            <w:proofErr w:type="spellEnd"/>
           </w:p>
         </w:tc>
         <w:tc>
@@ -10527,6 +10980,7 @@
                 <w:lang w:val="vi-VN"/>
               </w:rPr>
             </w:pPr>
+            <w:proofErr w:type="spellStart"/>
             <w:r>
               <w:rPr>
                 <w:b w:val="0"/>
@@ -10534,6 +10988,7 @@
               </w:rPr>
               <w:t>pendingRenameSource</w:t>
             </w:r>
+            <w:proofErr w:type="spellEnd"/>
           </w:p>
         </w:tc>
         <w:tc>
@@ -10548,8 +11003,13 @@
                 <w:lang w:val="vi-VN"/>
               </w:rPr>
             </w:pPr>
-            <w:r>
-              <w:t>std::filesystem::path</w:t>
+            <w:proofErr w:type="gramStart"/>
+            <w:r>
+              <w:t>std::filesystem::</w:t>
+            </w:r>
+            <w:proofErr w:type="gramEnd"/>
+            <w:r>
+              <w:t>path</w:t>
             </w:r>
           </w:p>
         </w:tc>
@@ -10603,6 +11063,7 @@
                 <w:lang w:val="vi-VN"/>
               </w:rPr>
             </w:pPr>
+            <w:proofErr w:type="spellStart"/>
             <w:r>
               <w:rPr>
                 <w:b w:val="0"/>
@@ -10610,6 +11071,7 @@
               </w:rPr>
               <w:t>hasPendingRename</w:t>
             </w:r>
+            <w:proofErr w:type="spellEnd"/>
           </w:p>
         </w:tc>
         <w:tc>
@@ -10676,6 +11138,7 @@
                 <w:lang w:val="vi-VN"/>
               </w:rPr>
             </w:pPr>
+            <w:proofErr w:type="spellStart"/>
             <w:r>
               <w:rPr>
                 <w:b w:val="0"/>
@@ -10684,6 +11147,7 @@
               <w:lastRenderedPageBreak/>
               <w:t>transferActive</w:t>
             </w:r>
+            <w:proofErr w:type="spellEnd"/>
           </w:p>
         </w:tc>
         <w:tc>
@@ -10695,8 +11159,13 @@
               <w:pStyle w:val="Pseudocode"/>
               <w:cnfStyle w:val="000000000000" w:firstRow="0" w:lastRow="0" w:firstColumn="0" w:lastColumn="0" w:oddVBand="0" w:evenVBand="0" w:oddHBand="0" w:evenHBand="0" w:firstRowFirstColumn="0" w:firstRowLastColumn="0" w:lastRowFirstColumn="0" w:lastRowLastColumn="0"/>
             </w:pPr>
-            <w:r>
-              <w:t>std::atomic&lt;bool&gt;</w:t>
+            <w:proofErr w:type="gramStart"/>
+            <w:r>
+              <w:t>std::</w:t>
+            </w:r>
+            <w:proofErr w:type="gramEnd"/>
+            <w:r>
+              <w:t>atomic&lt;bool&gt;</w:t>
             </w:r>
           </w:p>
         </w:tc>
@@ -10731,6 +11200,7 @@
                 <w:bCs w:val="0"/>
               </w:rPr>
             </w:pPr>
+            <w:proofErr w:type="spellStart"/>
             <w:r>
               <w:rPr>
                 <w:b w:val="0"/>
@@ -10738,6 +11208,7 @@
               </w:rPr>
               <w:t>abortRequested</w:t>
             </w:r>
+            <w:proofErr w:type="spellEnd"/>
           </w:p>
         </w:tc>
         <w:tc>
@@ -10749,8 +11220,13 @@
               <w:pStyle w:val="Pseudocode"/>
               <w:cnfStyle w:val="000000100000" w:firstRow="0" w:lastRow="0" w:firstColumn="0" w:lastColumn="0" w:oddVBand="0" w:evenVBand="0" w:oddHBand="1" w:evenHBand="0" w:firstRowFirstColumn="0" w:firstRowLastColumn="0" w:lastRowFirstColumn="0" w:lastRowLastColumn="0"/>
             </w:pPr>
-            <w:r>
-              <w:t>std::atomic&lt;bool&gt;</w:t>
+            <w:proofErr w:type="gramStart"/>
+            <w:r>
+              <w:t>std::</w:t>
+            </w:r>
+            <w:proofErr w:type="gramEnd"/>
+            <w:r>
+              <w:t>atomic&lt;bool&gt;</w:t>
             </w:r>
           </w:p>
         </w:tc>
@@ -10791,6 +11267,7 @@
                 <w:bCs w:val="0"/>
               </w:rPr>
             </w:pPr>
+            <w:proofErr w:type="spellStart"/>
             <w:r>
               <w:rPr>
                 <w:b w:val="0"/>
@@ -10798,6 +11275,7 @@
               </w:rPr>
               <w:t>transferWorker</w:t>
             </w:r>
+            <w:proofErr w:type="spellEnd"/>
           </w:p>
         </w:tc>
         <w:tc>
@@ -10809,8 +11287,13 @@
               <w:pStyle w:val="Pseudocode"/>
               <w:cnfStyle w:val="000000000000" w:firstRow="0" w:lastRow="0" w:firstColumn="0" w:lastColumn="0" w:oddVBand="0" w:evenVBand="0" w:oddHBand="0" w:evenHBand="0" w:firstRowFirstColumn="0" w:firstRowLastColumn="0" w:lastRowFirstColumn="0" w:lastRowLastColumn="0"/>
             </w:pPr>
-            <w:r>
-              <w:t>std::thread</w:t>
+            <w:proofErr w:type="gramStart"/>
+            <w:r>
+              <w:t>std::</w:t>
+            </w:r>
+            <w:proofErr w:type="gramEnd"/>
+            <w:r>
+              <w:t>thread</w:t>
             </w:r>
           </w:p>
         </w:tc>
@@ -10881,6 +11364,7 @@
                 <w:bCs w:val="0"/>
               </w:rPr>
             </w:pPr>
+            <w:proofErr w:type="spellStart"/>
             <w:r>
               <w:rPr>
                 <w:b w:val="0"/>
@@ -10888,6 +11372,7 @@
               </w:rPr>
               <w:t>replyMutex</w:t>
             </w:r>
+            <w:proofErr w:type="spellEnd"/>
           </w:p>
         </w:tc>
         <w:tc>
@@ -10899,8 +11384,13 @@
               <w:pStyle w:val="Pseudocode"/>
               <w:cnfStyle w:val="000000100000" w:firstRow="0" w:lastRow="0" w:firstColumn="0" w:lastColumn="0" w:oddVBand="0" w:evenVBand="0" w:oddHBand="1" w:evenHBand="0" w:firstRowFirstColumn="0" w:firstRowLastColumn="0" w:lastRowFirstColumn="0" w:lastRowLastColumn="0"/>
             </w:pPr>
-            <w:r>
-              <w:t>std::mutex</w:t>
+            <w:proofErr w:type="gramStart"/>
+            <w:r>
+              <w:t>std::</w:t>
+            </w:r>
+            <w:proofErr w:type="gramEnd"/>
+            <w:r>
+              <w:t>mutex</w:t>
             </w:r>
           </w:p>
         </w:tc>
@@ -10912,8 +11402,13 @@
             <w:pPr>
               <w:cnfStyle w:val="000000100000" w:firstRow="0" w:lastRow="0" w:firstColumn="0" w:lastColumn="0" w:oddVBand="0" w:evenVBand="0" w:oddHBand="1" w:evenHBand="0" w:firstRowFirstColumn="0" w:firstRowLastColumn="0" w:lastRowFirstColumn="0" w:lastRowLastColumn="0"/>
             </w:pPr>
-            <w:r>
-              <w:t>Guards concurrent writes to the control socket, since the transfer worker now sends its own completion reply independently of the control thread</w:t>
+            <w:proofErr w:type="gramStart"/>
+            <w:r>
+              <w:t>Guards</w:t>
+            </w:r>
+            <w:proofErr w:type="gramEnd"/>
+            <w:r>
+              <w:t xml:space="preserve"> concurrent writes to the control socket, since the transfer worker now sends its own completion reply independently of the control thread</w:t>
             </w:r>
           </w:p>
         </w:tc>
@@ -10932,6 +11427,7 @@
                 <w:bCs w:val="0"/>
               </w:rPr>
             </w:pPr>
+            <w:proofErr w:type="spellStart"/>
             <w:r>
               <w:rPr>
                 <w:b w:val="0"/>
@@ -10939,6 +11435,7 @@
               </w:rPr>
               <w:t>pendingUniqueFilename</w:t>
             </w:r>
+            <w:proofErr w:type="spellEnd"/>
           </w:p>
         </w:tc>
         <w:tc>
@@ -10950,8 +11447,13 @@
               <w:pStyle w:val="Pseudocode"/>
               <w:cnfStyle w:val="000000000000" w:firstRow="0" w:lastRow="0" w:firstColumn="0" w:lastColumn="0" w:oddVBand="0" w:evenVBand="0" w:oddHBand="0" w:evenHBand="0" w:firstRowFirstColumn="0" w:firstRowLastColumn="0" w:lastRowFirstColumn="0" w:lastRowLastColumn="0"/>
             </w:pPr>
-            <w:r>
-              <w:t>std::string</w:t>
+            <w:proofErr w:type="gramStart"/>
+            <w:r>
+              <w:t>std::</w:t>
+            </w:r>
+            <w:proofErr w:type="gramEnd"/>
+            <w:r>
+              <w:t>string</w:t>
             </w:r>
           </w:p>
         </w:tc>
@@ -10992,6 +11494,7 @@
       <w:r>
         <w:t xml:space="preserve">Client – </w:t>
       </w:r>
+      <w:proofErr w:type="spellStart"/>
       <w:r>
         <w:rPr>
           <w:rStyle w:val="PseudocodeChar"/>
@@ -11000,6 +11503,7 @@
         </w:rPr>
         <w:t>ClientState</w:t>
       </w:r>
+      <w:proofErr w:type="spellEnd"/>
     </w:p>
     <w:p>
       <w:pPr>
@@ -11023,8 +11527,30 @@
         <w:rPr>
           <w:rStyle w:val="PseudocodeChar"/>
         </w:rPr>
-        <w:t>/src/control/Session.h</w:t>
-      </w:r>
+        <w:t>/</w:t>
+      </w:r>
+      <w:proofErr w:type="spellStart"/>
+      <w:r>
+        <w:rPr>
+          <w:rStyle w:val="PseudocodeChar"/>
+        </w:rPr>
+        <w:t>src</w:t>
+      </w:r>
+      <w:proofErr w:type="spellEnd"/>
+      <w:r>
+        <w:rPr>
+          <w:rStyle w:val="PseudocodeChar"/>
+        </w:rPr>
+        <w:t>/control/</w:t>
+      </w:r>
+      <w:proofErr w:type="spellStart"/>
+      <w:r>
+        <w:rPr>
+          <w:rStyle w:val="PseudocodeChar"/>
+        </w:rPr>
+        <w:t>Session.h</w:t>
+      </w:r>
+      <w:proofErr w:type="spellEnd"/>
       <w:r>
         <w:rPr>
           <w:lang w:val="vi-VN"/>
@@ -11102,6 +11628,7 @@
                 <w:bCs w:val="0"/>
               </w:rPr>
             </w:pPr>
+            <w:proofErr w:type="spellStart"/>
             <w:r>
               <w:rPr>
                 <w:b w:val="0"/>
@@ -11109,6 +11636,7 @@
               </w:rPr>
               <w:t>dataMode</w:t>
             </w:r>
+            <w:proofErr w:type="spellEnd"/>
           </w:p>
         </w:tc>
         <w:tc>
@@ -11120,9 +11648,11 @@
               <w:pStyle w:val="Pseudocode"/>
               <w:cnfStyle w:val="000000100000" w:firstRow="0" w:lastRow="0" w:firstColumn="0" w:lastColumn="0" w:oddVBand="0" w:evenVBand="0" w:oddHBand="1" w:evenHBand="0" w:firstRowFirstColumn="0" w:firstRowLastColumn="0" w:lastRowFirstColumn="0" w:lastRowLastColumn="0"/>
             </w:pPr>
+            <w:proofErr w:type="spellStart"/>
             <w:r>
               <w:t>DataMode</w:t>
             </w:r>
+            <w:proofErr w:type="spellEnd"/>
           </w:p>
         </w:tc>
         <w:tc>
@@ -11136,12 +11666,14 @@
             <w:r>
               <w:t xml:space="preserve">Client-side equivalent of </w:t>
             </w:r>
+            <w:proofErr w:type="spellStart"/>
             <w:r>
               <w:rPr>
                 <w:rStyle w:val="PseudocodeChar"/>
               </w:rPr>
               <w:t>DataChannelMode</w:t>
             </w:r>
+            <w:proofErr w:type="spellEnd"/>
           </w:p>
         </w:tc>
       </w:tr>
@@ -11159,6 +11691,7 @@
                 <w:bCs w:val="0"/>
               </w:rPr>
             </w:pPr>
+            <w:proofErr w:type="spellStart"/>
             <w:r>
               <w:rPr>
                 <w:b w:val="0"/>
@@ -11166,6 +11699,7 @@
               </w:rPr>
               <w:t>pendingDataSocket</w:t>
             </w:r>
+            <w:proofErr w:type="spellEnd"/>
           </w:p>
         </w:tc>
         <w:tc>
@@ -11213,6 +11747,7 @@
                 <w:bCs w:val="0"/>
               </w:rPr>
             </w:pPr>
+            <w:proofErr w:type="spellStart"/>
             <w:r>
               <w:rPr>
                 <w:b w:val="0"/>
@@ -11220,6 +11755,7 @@
               </w:rPr>
               <w:t>passiveAddress</w:t>
             </w:r>
+            <w:proofErr w:type="spellEnd"/>
           </w:p>
         </w:tc>
         <w:tc>
@@ -11231,9 +11767,11 @@
               <w:pStyle w:val="Pseudocode"/>
               <w:cnfStyle w:val="000000100000" w:firstRow="0" w:lastRow="0" w:firstColumn="0" w:lastColumn="0" w:oddVBand="0" w:evenVBand="0" w:oddHBand="1" w:evenHBand="0" w:firstRowFirstColumn="0" w:firstRowLastColumn="0" w:lastRowFirstColumn="0" w:lastRowLastColumn="0"/>
             </w:pPr>
+            <w:proofErr w:type="spellStart"/>
             <w:r>
               <w:t>sockaddr_in</w:t>
             </w:r>
+            <w:proofErr w:type="spellEnd"/>
           </w:p>
         </w:tc>
         <w:tc>
@@ -11273,6 +11811,7 @@
                 <w:bCs w:val="0"/>
               </w:rPr>
             </w:pPr>
+            <w:proofErr w:type="spellStart"/>
             <w:r>
               <w:rPr>
                 <w:b w:val="0"/>
@@ -11280,6 +11819,7 @@
               </w:rPr>
               <w:t>serverAddress</w:t>
             </w:r>
+            <w:proofErr w:type="spellEnd"/>
           </w:p>
         </w:tc>
         <w:tc>
@@ -11291,9 +11831,11 @@
               <w:pStyle w:val="Pseudocode"/>
               <w:cnfStyle w:val="000000000000" w:firstRow="0" w:lastRow="0" w:firstColumn="0" w:lastColumn="0" w:oddVBand="0" w:evenVBand="0" w:oddHBand="0" w:evenHBand="0" w:firstRowFirstColumn="0" w:firstRowLastColumn="0" w:lastRowFirstColumn="0" w:lastRowLastColumn="0"/>
             </w:pPr>
+            <w:proofErr w:type="spellStart"/>
             <w:r>
               <w:t>sockaddr_in</w:t>
             </w:r>
+            <w:proofErr w:type="spellEnd"/>
           </w:p>
         </w:tc>
         <w:tc>
@@ -11327,6 +11869,7 @@
                 <w:bCs w:val="0"/>
               </w:rPr>
             </w:pPr>
+            <w:proofErr w:type="spellStart"/>
             <w:r>
               <w:rPr>
                 <w:b w:val="0"/>
@@ -11335,6 +11878,7 @@
               <w:lastRenderedPageBreak/>
               <w:t>transferMode</w:t>
             </w:r>
+            <w:proofErr w:type="spellEnd"/>
           </w:p>
         </w:tc>
         <w:tc>
@@ -11346,9 +11890,11 @@
               <w:pStyle w:val="Pseudocode"/>
               <w:cnfStyle w:val="000000100000" w:firstRow="0" w:lastRow="0" w:firstColumn="0" w:lastColumn="0" w:oddVBand="0" w:evenVBand="0" w:oddHBand="1" w:evenHBand="0" w:firstRowFirstColumn="0" w:firstRowLastColumn="0" w:lastRowFirstColumn="0" w:lastRowLastColumn="0"/>
             </w:pPr>
+            <w:proofErr w:type="spellStart"/>
             <w:r>
               <w:t>TransferMode</w:t>
             </w:r>
+            <w:proofErr w:type="spellEnd"/>
           </w:p>
         </w:tc>
         <w:tc>
@@ -11388,6 +11934,7 @@
                 <w:bCs w:val="0"/>
               </w:rPr>
             </w:pPr>
+            <w:proofErr w:type="spellStart"/>
             <w:r>
               <w:rPr>
                 <w:b w:val="0"/>
@@ -11395,6 +11942,7 @@
               </w:rPr>
               <w:t>replyBuffer</w:t>
             </w:r>
+            <w:proofErr w:type="spellEnd"/>
           </w:p>
         </w:tc>
         <w:tc>
@@ -11406,8 +11954,13 @@
               <w:pStyle w:val="Pseudocode"/>
               <w:cnfStyle w:val="000000000000" w:firstRow="0" w:lastRow="0" w:firstColumn="0" w:lastColumn="0" w:oddVBand="0" w:evenVBand="0" w:oddHBand="0" w:evenHBand="0" w:firstRowFirstColumn="0" w:firstRowLastColumn="0" w:lastRowFirstColumn="0" w:lastRowLastColumn="0"/>
             </w:pPr>
-            <w:r>
-              <w:t>std::string</w:t>
+            <w:proofErr w:type="gramStart"/>
+            <w:r>
+              <w:t>std::</w:t>
+            </w:r>
+            <w:proofErr w:type="gramEnd"/>
+            <w:r>
+              <w:t>string</w:t>
             </w:r>
           </w:p>
         </w:tc>
@@ -11472,6 +12025,8 @@
       </w:r>
     </w:p>
     <w:p>
+      <w:proofErr w:type="spellStart"/>
+      <w:proofErr w:type="gramStart"/>
       <w:r>
         <w:rPr>
           <w:rStyle w:val="PseudocodeChar"/>
@@ -11480,6 +12035,7 @@
         </w:rPr>
         <w:t>SendResult</w:t>
       </w:r>
+      <w:proofErr w:type="spellEnd"/>
       <w:r>
         <w:t xml:space="preserve"> </w:t>
       </w:r>
@@ -11487,14 +12043,57 @@
         <w:rPr>
           <w:lang w:val="vi-VN"/>
         </w:rPr>
-        <w:t xml:space="preserve">, reside at </w:t>
+        <w:t>,</w:t>
+      </w:r>
+      <w:proofErr w:type="gramEnd"/>
+      <w:r>
+        <w:rPr>
+          <w:lang w:val="vi-VN"/>
+        </w:rPr>
+        <w:t xml:space="preserve"> reside at </w:t>
       </w:r>
       <w:r>
         <w:rPr>
           <w:rStyle w:val="PseudocodeChar"/>
         </w:rPr>
-        <w:t>server/src/datachannel/DataChannelSession.h</w:t>
-      </w:r>
+        <w:t>server/</w:t>
+      </w:r>
+      <w:proofErr w:type="spellStart"/>
+      <w:r>
+        <w:rPr>
+          <w:rStyle w:val="PseudocodeChar"/>
+        </w:rPr>
+        <w:t>src</w:t>
+      </w:r>
+      <w:proofErr w:type="spellEnd"/>
+      <w:r>
+        <w:rPr>
+          <w:rStyle w:val="PseudocodeChar"/>
+        </w:rPr>
+        <w:t>/</w:t>
+      </w:r>
+      <w:proofErr w:type="spellStart"/>
+      <w:r>
+        <w:rPr>
+          <w:rStyle w:val="PseudocodeChar"/>
+        </w:rPr>
+        <w:t>datachannel</w:t>
+      </w:r>
+      <w:proofErr w:type="spellEnd"/>
+      <w:r>
+        <w:rPr>
+          <w:rStyle w:val="PseudocodeChar"/>
+        </w:rPr>
+        <w:t>/</w:t>
+      </w:r>
+      <w:proofErr w:type="spellStart"/>
+      <w:r>
+        <w:rPr>
+          <w:rStyle w:val="PseudocodeChar"/>
+        </w:rPr>
+        <w:t>DataChannelSession.h</w:t>
+      </w:r>
+      <w:proofErr w:type="spellEnd"/>
       <w:r>
         <w:rPr>
           <w:lang w:val="vi-VN"/>
@@ -11502,7 +12101,15 @@
         <w:t xml:space="preserve">, is </w:t>
       </w:r>
       <w:r>
-        <w:t>the return type of sendFile, replacing a bare bool:</w:t>
+        <w:t xml:space="preserve">the return type of </w:t>
+      </w:r>
+      <w:proofErr w:type="spellStart"/>
+      <w:r>
+        <w:t>sendFile</w:t>
+      </w:r>
+      <w:proofErr w:type="spellEnd"/>
+      <w:r>
+        <w:t>, replacing a bare bool:</w:t>
       </w:r>
     </w:p>
     <w:tbl>
@@ -11625,13 +12232,35 @@
               </w:rPr>
             </w:pPr>
             <w:r>
-              <w:t xml:space="preserve">Whether the transfer completed successfully (also exposed via </w:t>
+              <w:t xml:space="preserve">Whether the transfer </w:t>
+            </w:r>
+            <w:proofErr w:type="gramStart"/>
+            <w:r>
+              <w:t>completed</w:t>
+            </w:r>
+            <w:proofErr w:type="gramEnd"/>
+            <w:r>
+              <w:t xml:space="preserve"> successfully (also exposed via </w:t>
             </w:r>
             <w:r>
               <w:rPr>
                 <w:rStyle w:val="PseudocodeChar"/>
               </w:rPr>
-              <w:t>operator bool()</w:t>
+              <w:t xml:space="preserve">operator </w:t>
+            </w:r>
+            <w:proofErr w:type="gramStart"/>
+            <w:r>
+              <w:rPr>
+                <w:rStyle w:val="PseudocodeChar"/>
+              </w:rPr>
+              <w:t>bool(</w:t>
+            </w:r>
+            <w:proofErr w:type="gramEnd"/>
+            <w:r>
+              <w:rPr>
+                <w:rStyle w:val="PseudocodeChar"/>
+              </w:rPr>
+              <w:t>)</w:t>
             </w:r>
             <w:r>
               <w:t xml:space="preserve"> for direct use in conditionals)</w:t>
@@ -11675,8 +12304,13 @@
                 <w:lang w:val="vi-VN"/>
               </w:rPr>
             </w:pPr>
-            <w:r>
-              <w:t>std::string</w:t>
+            <w:proofErr w:type="gramStart"/>
+            <w:r>
+              <w:t>std::</w:t>
+            </w:r>
+            <w:proofErr w:type="gramEnd"/>
+            <w:r>
+              <w:t>string</w:t>
             </w:r>
           </w:p>
         </w:tc>
@@ -11711,6 +12345,7 @@
           <w:lang w:val="vi-VN"/>
         </w:rPr>
       </w:pPr>
+      <w:proofErr w:type="spellStart"/>
       <w:r>
         <w:rPr>
           <w:rStyle w:val="PseudocodeChar"/>
@@ -11719,6 +12354,7 @@
         </w:rPr>
         <w:t>UploadKind</w:t>
       </w:r>
+      <w:proofErr w:type="spellEnd"/>
       <w:r>
         <w:rPr>
           <w:lang w:val="vi-VN"/>
@@ -11742,8 +12378,16 @@
         <w:rPr>
           <w:lang w:val="vi-VN"/>
         </w:rPr>
-        <w:t xml:space="preserve"> in a</w:t>
-      </w:r>
+        <w:t xml:space="preserve"> in </w:t>
+      </w:r>
+      <w:proofErr w:type="gramStart"/>
+      <w:r>
+        <w:rPr>
+          <w:lang w:val="vi-VN"/>
+        </w:rPr>
+        <w:t>a</w:t>
+      </w:r>
+      <w:proofErr w:type="gramEnd"/>
       <w:r>
         <w:rPr>
           <w:lang w:val="vi-VN"/>
@@ -11774,12 +12418,14 @@
         </w:rPr>
         <w:t>an enum distinguishing the three upload commands that now share one implementation (</w:t>
       </w:r>
+      <w:proofErr w:type="spellStart"/>
       <w:r>
         <w:rPr>
           <w:rStyle w:val="PseudocodeChar"/>
         </w:rPr>
         <w:t>startUploadTransfer</w:t>
       </w:r>
+      <w:proofErr w:type="spellEnd"/>
       <w:r>
         <w:rPr>
           <w:lang w:val="vi-VN"/>
@@ -12085,6 +12731,7 @@
           <w:lang w:val="vi-VN"/>
         </w:rPr>
       </w:pPr>
+      <w:proofErr w:type="spellStart"/>
       <w:r>
         <w:rPr>
           <w:rStyle w:val="PseudocodeChar"/>
@@ -12093,6 +12740,7 @@
         </w:rPr>
         <w:t>DirEntryInfo</w:t>
       </w:r>
+      <w:proofErr w:type="spellEnd"/>
     </w:p>
     <w:p>
       <w:pPr>
@@ -12110,8 +12758,30 @@
         <w:rPr>
           <w:rStyle w:val="PseudocodeChar"/>
         </w:rPr>
-        <w:t>server/src/filesystem/DirectoryService.h</w:t>
-      </w:r>
+        <w:t>server/</w:t>
+      </w:r>
+      <w:proofErr w:type="spellStart"/>
+      <w:r>
+        <w:rPr>
+          <w:rStyle w:val="PseudocodeChar"/>
+        </w:rPr>
+        <w:t>src</w:t>
+      </w:r>
+      <w:proofErr w:type="spellEnd"/>
+      <w:r>
+        <w:rPr>
+          <w:rStyle w:val="PseudocodeChar"/>
+        </w:rPr>
+        <w:t>/filesystem/</w:t>
+      </w:r>
+      <w:proofErr w:type="spellStart"/>
+      <w:r>
+        <w:rPr>
+          <w:rStyle w:val="PseudocodeChar"/>
+        </w:rPr>
+        <w:t>DirectoryService.h</w:t>
+      </w:r>
+      <w:proofErr w:type="spellEnd"/>
       <w:r>
         <w:rPr>
           <w:lang w:val="vi-VN"/>
@@ -12204,6 +12874,7 @@
                 <w:lang w:val="vi-VN"/>
               </w:rPr>
             </w:pPr>
+            <w:proofErr w:type="spellStart"/>
             <w:r>
               <w:rPr>
                 <w:b w:val="0"/>
@@ -12211,6 +12882,7 @@
               </w:rPr>
               <w:t>formatPermissions</w:t>
             </w:r>
+            <w:proofErr w:type="spellEnd"/>
           </w:p>
         </w:tc>
         <w:tc>
@@ -12225,8 +12897,13 @@
                 <w:lang w:val="vi-VN"/>
               </w:rPr>
             </w:pPr>
-            <w:r>
-              <w:t>std::string</w:t>
+            <w:proofErr w:type="gramStart"/>
+            <w:r>
+              <w:t>std::</w:t>
+            </w:r>
+            <w:proofErr w:type="gramEnd"/>
+            <w:r>
+              <w:t>string</w:t>
             </w:r>
           </w:p>
         </w:tc>
@@ -12248,7 +12925,21 @@
               <w:rPr>
                 <w:rStyle w:val="PseudocodeChar"/>
               </w:rPr>
-              <w:t>-rw-r--r--</w:t>
+              <w:t>-</w:t>
+            </w:r>
+            <w:proofErr w:type="spellStart"/>
+            <w:r>
+              <w:rPr>
+                <w:rStyle w:val="PseudocodeChar"/>
+              </w:rPr>
+              <w:t>rw</w:t>
+            </w:r>
+            <w:proofErr w:type="spellEnd"/>
+            <w:r>
+              <w:rPr>
+                <w:rStyle w:val="PseudocodeChar"/>
+              </w:rPr>
+              <w:t>-r--r--</w:t>
             </w:r>
             <w:r>
               <w:t xml:space="preserve">) for </w:t>
@@ -12301,8 +12992,13 @@
                 <w:lang w:val="vi-VN"/>
               </w:rPr>
             </w:pPr>
-            <w:r>
-              <w:t>std::string</w:t>
+            <w:proofErr w:type="gramStart"/>
+            <w:r>
+              <w:t>std::</w:t>
+            </w:r>
+            <w:proofErr w:type="gramEnd"/>
+            <w:r>
+              <w:t>string</w:t>
             </w:r>
           </w:p>
         </w:tc>
@@ -12341,6 +13037,7 @@
                 <w:lang w:val="vi-VN"/>
               </w:rPr>
             </w:pPr>
+            <w:proofErr w:type="spellStart"/>
             <w:r>
               <w:rPr>
                 <w:b w:val="0"/>
@@ -12348,6 +13045,7 @@
               </w:rPr>
               <w:t>isDirectory</w:t>
             </w:r>
+            <w:proofErr w:type="spellEnd"/>
           </w:p>
         </w:tc>
         <w:tc>
@@ -12402,6 +13100,7 @@
                 <w:lang w:val="vi-VN"/>
               </w:rPr>
             </w:pPr>
+            <w:proofErr w:type="spellStart"/>
             <w:r>
               <w:rPr>
                 <w:b w:val="0"/>
@@ -12409,6 +13108,7 @@
               </w:rPr>
               <w:t>sizeBytes</w:t>
             </w:r>
+            <w:proofErr w:type="spellEnd"/>
           </w:p>
         </w:tc>
         <w:tc>
@@ -12423,9 +13123,11 @@
                 <w:lang w:val="vi-VN"/>
               </w:rPr>
             </w:pPr>
+            <w:proofErr w:type="spellStart"/>
             <w:r>
               <w:t>uintmax_t</w:t>
             </w:r>
+            <w:proofErr w:type="spellEnd"/>
           </w:p>
         </w:tc>
         <w:tc>
@@ -12466,14 +13168,36 @@
           <w:lang w:val="vi-VN"/>
         </w:rPr>
       </w:pPr>
+      <w:proofErr w:type="spellStart"/>
+      <w:proofErr w:type="gramStart"/>
       <w:r>
         <w:rPr>
           <w:rStyle w:val="PseudocodeChar"/>
           <w:sz w:val="28"/>
           <w:szCs w:val="36"/>
         </w:rPr>
-        <w:t>DirectoryService::PathMetadata</w:t>
-      </w:r>
+        <w:t>DirectoryService</w:t>
+      </w:r>
+      <w:proofErr w:type="spellEnd"/>
+      <w:r>
+        <w:rPr>
+          <w:rStyle w:val="PseudocodeChar"/>
+          <w:sz w:val="28"/>
+          <w:szCs w:val="36"/>
+        </w:rPr>
+        <w:t>::</w:t>
+      </w:r>
+      <w:proofErr w:type="spellStart"/>
+      <w:proofErr w:type="gramEnd"/>
+      <w:r>
+        <w:rPr>
+          <w:rStyle w:val="PseudocodeChar"/>
+          <w:sz w:val="28"/>
+          <w:szCs w:val="36"/>
+        </w:rPr>
+        <w:t>PathMetadata</w:t>
+      </w:r>
+      <w:proofErr w:type="spellEnd"/>
     </w:p>
     <w:tbl>
       <w:tblPr>
@@ -12621,6 +13345,7 @@
                 <w:lang w:val="vi-VN"/>
               </w:rPr>
             </w:pPr>
+            <w:proofErr w:type="spellStart"/>
             <w:r>
               <w:rPr>
                 <w:b w:val="0"/>
@@ -12628,6 +13353,7 @@
               </w:rPr>
               <w:t>isDirectory</w:t>
             </w:r>
+            <w:proofErr w:type="spellEnd"/>
           </w:p>
         </w:tc>
         <w:tc>
@@ -12685,6 +13411,7 @@
                 <w:lang w:val="vi-VN"/>
               </w:rPr>
             </w:pPr>
+            <w:proofErr w:type="spellStart"/>
             <w:r>
               <w:rPr>
                 <w:b w:val="0"/>
@@ -12692,6 +13419,7 @@
               </w:rPr>
               <w:t>sizeBytes</w:t>
             </w:r>
+            <w:proofErr w:type="spellEnd"/>
           </w:p>
         </w:tc>
         <w:tc>
@@ -12746,6 +13474,7 @@
                 <w:lang w:val="vi-VN"/>
               </w:rPr>
             </w:pPr>
+            <w:proofErr w:type="spellStart"/>
             <w:r>
               <w:rPr>
                 <w:b w:val="0"/>
@@ -12753,6 +13482,7 @@
               </w:rPr>
               <w:t>lastModified</w:t>
             </w:r>
+            <w:proofErr w:type="spellEnd"/>
           </w:p>
         </w:tc>
         <w:tc>
@@ -12767,9 +13497,11 @@
                 <w:lang w:val="vi-VN"/>
               </w:rPr>
             </w:pPr>
+            <w:proofErr w:type="spellStart"/>
             <w:r>
               <w:t>uintmax_t</w:t>
             </w:r>
+            <w:proofErr w:type="spellEnd"/>
           </w:p>
         </w:tc>
         <w:tc>
@@ -12817,13 +13549,33 @@
           <w:lang w:val="vi-VN"/>
         </w:rPr>
       </w:pPr>
+      <w:proofErr w:type="spellStart"/>
+      <w:proofErr w:type="gramStart"/>
       <w:r>
         <w:rPr>
           <w:rStyle w:val="PseudocodeChar"/>
           <w:sz w:val="28"/>
           <w:szCs w:val="36"/>
         </w:rPr>
-        <w:t>DirectoryService::Result</w:t>
+        <w:t>DirectoryService</w:t>
+      </w:r>
+      <w:proofErr w:type="spellEnd"/>
+      <w:r>
+        <w:rPr>
+          <w:rStyle w:val="PseudocodeChar"/>
+          <w:sz w:val="28"/>
+          <w:szCs w:val="36"/>
+        </w:rPr>
+        <w:t>::</w:t>
+      </w:r>
+      <w:proofErr w:type="gramEnd"/>
+      <w:r>
+        <w:rPr>
+          <w:rStyle w:val="PseudocodeChar"/>
+          <w:sz w:val="28"/>
+          <w:szCs w:val="36"/>
+        </w:rPr>
+        <w:t>Result</w:t>
       </w:r>
     </w:p>
     <w:tbl>
@@ -13054,8 +13806,13 @@
                 <w:lang w:val="vi-VN"/>
               </w:rPr>
             </w:pPr>
-            <w:r>
-              <w:t>std::string</w:t>
+            <w:proofErr w:type="gramStart"/>
+            <w:r>
+              <w:t>std::</w:t>
+            </w:r>
+            <w:proofErr w:type="gramEnd"/>
+            <w:r>
+              <w:t>string</w:t>
             </w:r>
           </w:p>
         </w:tc>
@@ -13128,6 +13885,7 @@
           <w:lang w:val="vi-VN"/>
         </w:rPr>
       </w:pPr>
+      <w:proofErr w:type="spellStart"/>
       <w:r>
         <w:rPr>
           <w:rStyle w:val="PseudocodeChar"/>
@@ -13136,6 +13894,7 @@
         </w:rPr>
         <w:t>InFlightPacket</w:t>
       </w:r>
+      <w:proofErr w:type="spellEnd"/>
     </w:p>
     <w:p>
       <w:pPr>
@@ -13166,8 +13925,49 @@
           <w:rFonts w:ascii="Consolas" w:hAnsi="Consolas"/>
           <w:sz w:val="22"/>
         </w:rPr>
-        <w:t>server/src/rdt/RdtSender.h</w:t>
-      </w:r>
+        <w:t>server/</w:t>
+      </w:r>
+      <w:proofErr w:type="spellStart"/>
+      <w:r>
+        <w:rPr>
+          <w:rFonts w:ascii="Consolas" w:hAnsi="Consolas"/>
+          <w:sz w:val="22"/>
+        </w:rPr>
+        <w:t>src</w:t>
+      </w:r>
+      <w:proofErr w:type="spellEnd"/>
+      <w:r>
+        <w:rPr>
+          <w:rFonts w:ascii="Consolas" w:hAnsi="Consolas"/>
+          <w:sz w:val="22"/>
+        </w:rPr>
+        <w:t>/</w:t>
+      </w:r>
+      <w:proofErr w:type="spellStart"/>
+      <w:r>
+        <w:rPr>
+          <w:rFonts w:ascii="Consolas" w:hAnsi="Consolas"/>
+          <w:sz w:val="22"/>
+        </w:rPr>
+        <w:t>rdt</w:t>
+      </w:r>
+      <w:proofErr w:type="spellEnd"/>
+      <w:r>
+        <w:rPr>
+          <w:rFonts w:ascii="Consolas" w:hAnsi="Consolas"/>
+          <w:sz w:val="22"/>
+        </w:rPr>
+        <w:t>/</w:t>
+      </w:r>
+      <w:proofErr w:type="spellStart"/>
+      <w:r>
+        <w:rPr>
+          <w:rFonts w:ascii="Consolas" w:hAnsi="Consolas"/>
+          <w:sz w:val="22"/>
+        </w:rPr>
+        <w:t>RdtSender.h</w:t>
+      </w:r>
+      <w:proofErr w:type="spellEnd"/>
       <w:r>
         <w:rPr>
           <w:lang w:val="vi-VN"/>
@@ -13258,6 +14058,7 @@
                 <w:lang w:val="vi-VN"/>
               </w:rPr>
             </w:pPr>
+            <w:proofErr w:type="spellStart"/>
             <w:r>
               <w:rPr>
                 <w:b w:val="0"/>
@@ -13265,6 +14066,7 @@
               </w:rPr>
               <w:t>seq_num</w:t>
             </w:r>
+            <w:proofErr w:type="spellEnd"/>
           </w:p>
         </w:tc>
         <w:tc>
@@ -13337,8 +14139,13 @@
                 <w:lang w:val="vi-VN"/>
               </w:rPr>
             </w:pPr>
-            <w:r>
-              <w:t>std::vector&lt;char&gt;</w:t>
+            <w:proofErr w:type="gramStart"/>
+            <w:r>
+              <w:t>std::</w:t>
+            </w:r>
+            <w:proofErr w:type="gramEnd"/>
+            <w:r>
+              <w:t>vector&lt;char&gt;</w:t>
             </w:r>
           </w:p>
         </w:tc>
@@ -13377,6 +14184,7 @@
                 <w:lang w:val="vi-VN"/>
               </w:rPr>
             </w:pPr>
+            <w:proofErr w:type="spellStart"/>
             <w:r>
               <w:rPr>
                 <w:b w:val="0"/>
@@ -13384,6 +14192,7 @@
               </w:rPr>
               <w:t>is_final</w:t>
             </w:r>
+            <w:proofErr w:type="spellEnd"/>
           </w:p>
         </w:tc>
         <w:tc>
@@ -13435,6 +14244,7 @@
                 <w:lang w:val="vi-VN"/>
               </w:rPr>
             </w:pPr>
+            <w:proofErr w:type="spellStart"/>
             <w:r>
               <w:rPr>
                 <w:b w:val="0"/>
@@ -13442,6 +14252,7 @@
               </w:rPr>
               <w:t>sent_time</w:t>
             </w:r>
+            <w:proofErr w:type="spellEnd"/>
           </w:p>
         </w:tc>
         <w:tc>
@@ -13456,9 +14267,29 @@
                 <w:lang w:val="vi-VN"/>
               </w:rPr>
             </w:pPr>
-            <w:r>
-              <w:t>std::chrono::steady_clock::time_point</w:t>
-            </w:r>
+            <w:proofErr w:type="gramStart"/>
+            <w:r>
+              <w:t>std::chrono::</w:t>
+            </w:r>
+            <w:proofErr w:type="spellStart"/>
+            <w:proofErr w:type="gramEnd"/>
+            <w:r>
+              <w:t>steady_</w:t>
+            </w:r>
+            <w:proofErr w:type="gramStart"/>
+            <w:r>
+              <w:t>clock</w:t>
+            </w:r>
+            <w:proofErr w:type="spellEnd"/>
+            <w:r>
+              <w:t>::</w:t>
+            </w:r>
+            <w:proofErr w:type="spellStart"/>
+            <w:proofErr w:type="gramEnd"/>
+            <w:r>
+              <w:t>time_point</w:t>
+            </w:r>
+            <w:proofErr w:type="spellEnd"/>
           </w:p>
         </w:tc>
         <w:tc>
@@ -13496,6 +14327,7 @@
                 <w:lang w:val="vi-VN"/>
               </w:rPr>
             </w:pPr>
+            <w:proofErr w:type="spellStart"/>
             <w:r>
               <w:rPr>
                 <w:b w:val="0"/>
@@ -13503,6 +14335,7 @@
               </w:rPr>
               <w:t>acked</w:t>
             </w:r>
+            <w:proofErr w:type="spellEnd"/>
           </w:p>
         </w:tc>
         <w:tc>
@@ -13594,6 +14427,7 @@
             <w:r>
               <w:t xml:space="preserve">Whether this packet has been resent </w:t>
             </w:r>
+            <w:proofErr w:type="gramStart"/>
             <w:r>
               <w:rPr>
                 <w:lang w:val="vi-VN"/>
@@ -13601,7 +14435,11 @@
               <w:t xml:space="preserve">– </w:t>
             </w:r>
             <w:r>
-              <w:t xml:space="preserve"> excludes it from RTT sampling (Karn's Algorithm)</w:t>
+              <w:t xml:space="preserve"> excludes</w:t>
+            </w:r>
+            <w:proofErr w:type="gramEnd"/>
+            <w:r>
+              <w:t xml:space="preserve"> it from RTT sampling (Karn's Algorithm)</w:t>
             </w:r>
           </w:p>
         </w:tc>
@@ -13721,15 +14559,25 @@
         </w:rPr>
         <w:t xml:space="preserve"> the sender's Selective Repeat sliding window; its slide condition and congestion-window interaction are detailed in Section </w:t>
       </w:r>
-      <w:hyperlink w:anchor="_RdtSender_–_Selective" w:history="1">
-        <w:r>
-          <w:rPr>
-            <w:rStyle w:val="Hyperlink"/>
-            <w:lang w:val="vi-VN"/>
-          </w:rPr>
-          <w:t>3.2.1</w:t>
-        </w:r>
-      </w:hyperlink>
+      <w:r>
+        <w:fldChar w:fldCharType="begin"/>
+      </w:r>
+      <w:r>
+        <w:instrText>HYPERLINK \l "_RdtSender_–_Selective"</w:instrText>
+      </w:r>
+      <w:r>
+        <w:fldChar w:fldCharType="separate"/>
+      </w:r>
+      <w:r>
+        <w:rPr>
+          <w:rStyle w:val="Hyperlink"/>
+          <w:lang w:val="vi-VN"/>
+        </w:rPr>
+        <w:t>3.2.1</w:t>
+      </w:r>
+      <w:r>
+        <w:fldChar w:fldCharType="end"/>
+      </w:r>
       <w:r>
         <w:rPr>
           <w:lang w:val="vi-VN"/>
@@ -14004,7 +14852,15 @@
         <w:t>–</w:t>
       </w:r>
       <w:r>
-        <w:t xml:space="preserve"> the handler runs to completion and the loop immediately reads the next command. For </w:t>
+        <w:t xml:space="preserve"> the handler runs to </w:t>
+      </w:r>
+      <w:proofErr w:type="gramStart"/>
+      <w:r>
+        <w:t>completion</w:t>
+      </w:r>
+      <w:proofErr w:type="gramEnd"/>
+      <w:r>
+        <w:t xml:space="preserve"> and the loop immediately reads the next command. For </w:t>
       </w:r>
       <w:r>
         <w:rPr>
@@ -14079,14 +14935,40 @@
       <w:r>
         <w:t xml:space="preserve"> while a transfer is still in progress. The worker thread sends its own completion reply once finished, independently of the control loop, guarded by </w:t>
       </w:r>
+      <w:proofErr w:type="spellStart"/>
+      <w:proofErr w:type="gramStart"/>
       <w:r>
         <w:rPr>
           <w:rStyle w:val="PseudocodeChar"/>
         </w:rPr>
-        <w:t>ClientSession::replyMutex</w:t>
-      </w:r>
-      <w:r>
-        <w:t xml:space="preserve"> to prevent the two threads from corrupting each other's writes to the same socket.</w:t>
+        <w:t>ClientSession</w:t>
+      </w:r>
+      <w:proofErr w:type="spellEnd"/>
+      <w:r>
+        <w:rPr>
+          <w:rStyle w:val="PseudocodeChar"/>
+        </w:rPr>
+        <w:t>::</w:t>
+      </w:r>
+      <w:proofErr w:type="spellStart"/>
+      <w:proofErr w:type="gramEnd"/>
+      <w:r>
+        <w:rPr>
+          <w:rStyle w:val="PseudocodeChar"/>
+        </w:rPr>
+        <w:t>replyMutex</w:t>
+      </w:r>
+      <w:proofErr w:type="spellEnd"/>
+      <w:r>
+        <w:t xml:space="preserve"> to prevent the two threads from corrupting each other's </w:t>
+      </w:r>
+      <w:proofErr w:type="gramStart"/>
+      <w:r>
+        <w:t>writes</w:t>
+      </w:r>
+      <w:proofErr w:type="gramEnd"/>
+      <w:r>
+        <w:t xml:space="preserve"> to the same socket.</w:t>
       </w:r>
     </w:p>
     <w:p>
@@ -14363,6 +15245,7 @@
       </w:pPr>
       <w:bookmarkStart w:id="23" w:name="_RdtSender_–_Selective"/>
       <w:bookmarkEnd w:id="23"/>
+      <w:proofErr w:type="spellStart"/>
       <w:r>
         <w:rPr>
           <w:rStyle w:val="PseudocodeChar"/>
@@ -14371,6 +15254,7 @@
         </w:rPr>
         <w:t>RdtSender</w:t>
       </w:r>
+      <w:proofErr w:type="spellEnd"/>
       <w:r>
         <w:rPr>
           <w:sz w:val="36"/>
@@ -14641,7 +15525,23 @@
         <w:ind w:firstLine="360"/>
       </w:pPr>
       <w:r>
-        <w:t>RTT is sampled only from packets that were never retransmitted (Karn's Algorithm). On any timeout, the congestion window is halved and the retransmission timeout doubles, both bounded by the constants below; on a sustained run of clean ACKs equal to the current window size, the congestion window increases by 1.0.</w:t>
+        <w:t xml:space="preserve">RTT is sampled only from packets that were never retransmitted (Karn's Algorithm). On any timeout, the congestion window is </w:t>
+      </w:r>
+      <w:proofErr w:type="gramStart"/>
+      <w:r>
+        <w:t>halved</w:t>
+      </w:r>
+      <w:proofErr w:type="gramEnd"/>
+      <w:r>
+        <w:t xml:space="preserve"> and the retransmission timeout doubles, both </w:t>
+      </w:r>
+      <w:proofErr w:type="gramStart"/>
+      <w:r>
+        <w:t>bounded</w:t>
+      </w:r>
+      <w:proofErr w:type="gramEnd"/>
+      <w:r>
+        <w:t xml:space="preserve"> by the constants below; on a sustained run of clean ACKs equal to the current window size, the congestion window increases by 1.0.</w:t>
       </w:r>
     </w:p>
     <w:p>
@@ -15273,6 +16173,7 @@
           <w:lang w:val="vi-VN"/>
         </w:rPr>
       </w:pPr>
+      <w:proofErr w:type="spellStart"/>
       <w:r>
         <w:rPr>
           <w:rStyle w:val="PseudocodeChar"/>
@@ -15281,6 +16182,7 @@
         </w:rPr>
         <w:t>RdtReceiver</w:t>
       </w:r>
+      <w:proofErr w:type="spellEnd"/>
       <w:r>
         <w:rPr>
           <w:sz w:val="36"/>
@@ -15634,9 +16536,11 @@
       <w:r>
         <w:t xml:space="preserve">: </w:t>
       </w:r>
+      <w:proofErr w:type="spellStart"/>
       <w:r>
         <w:t>receiveNext</w:t>
       </w:r>
+      <w:proofErr w:type="spellEnd"/>
       <w:r>
         <w:t xml:space="preserve"> Flow</w:t>
       </w:r>
@@ -15689,21 +16593,25 @@
       <w:r>
         <w:t xml:space="preserve"> specifically which code path </w:t>
       </w:r>
+      <w:proofErr w:type="spellStart"/>
       <w:r>
         <w:rPr>
           <w:rStyle w:val="PseudocodeChar"/>
         </w:rPr>
         <w:t>CommandDispatcher</w:t>
       </w:r>
+      <w:proofErr w:type="spellEnd"/>
       <w:r>
         <w:t xml:space="preserve"> takes based on the session's </w:t>
       </w:r>
+      <w:proofErr w:type="spellStart"/>
       <w:r>
         <w:rPr>
           <w:rStyle w:val="PseudocodeChar"/>
         </w:rPr>
         <w:t>dataChannelMode</w:t>
       </w:r>
+      <w:proofErr w:type="spellEnd"/>
       <w:r>
         <w:t>.</w:t>
       </w:r>
@@ -15721,11 +16629,19 @@
       <w:r>
         <w:t xml:space="preserve"> opens a server-side ephemeral UDP socket, storing it directly in the session, and sets </w:t>
       </w:r>
+      <w:proofErr w:type="spellStart"/>
       <w:r>
         <w:rPr>
           <w:rStyle w:val="PseudocodeChar"/>
         </w:rPr>
-        <w:t>dataChannelMode = Passive</w:t>
+        <w:t>dataChannelMode</w:t>
+      </w:r>
+      <w:proofErr w:type="spellEnd"/>
+      <w:r>
+        <w:rPr>
+          <w:rStyle w:val="PseudocodeChar"/>
+        </w:rPr>
+        <w:t xml:space="preserve"> = Passive</w:t>
       </w:r>
       <w:r>
         <w:t xml:space="preserve">. </w:t>
@@ -15745,12 +16661,14 @@
       <w:r>
         <w:t xml:space="preserve"> via </w:t>
       </w:r>
+      <w:proofErr w:type="spellStart"/>
       <w:r>
         <w:rPr>
           <w:rStyle w:val="PseudocodeChar"/>
         </w:rPr>
         <w:t>portMatchesControlPeer</w:t>
       </w:r>
+      <w:proofErr w:type="spellEnd"/>
       <w:r>
         <w:t xml:space="preserve"> </w:t>
       </w:r>
@@ -15823,14 +16741,32 @@
         <w:t xml:space="preserve"> </w:t>
       </w:r>
       <w:r>
-        <w:t xml:space="preserve">is subsequently issued, the dispatcher first rejects the command if no mode was selected. Otherwise it branches: for Passive mode, it takes ownership of the already-open </w:t>
-      </w:r>
+        <w:t xml:space="preserve">is subsequently issued, the dispatcher first rejects the command if no mode was selected. </w:t>
+      </w:r>
+      <w:proofErr w:type="gramStart"/>
+      <w:r>
+        <w:t>Otherwise</w:t>
+      </w:r>
+      <w:proofErr w:type="gramEnd"/>
+      <w:r>
+        <w:t xml:space="preserve"> it </w:t>
+      </w:r>
+      <w:proofErr w:type="gramStart"/>
+      <w:r>
+        <w:t>branches:</w:t>
+      </w:r>
+      <w:proofErr w:type="gramEnd"/>
+      <w:r>
+        <w:t xml:space="preserve"> for Passive mode, it takes ownership of the already-open </w:t>
+      </w:r>
+      <w:proofErr w:type="spellStart"/>
       <w:r>
         <w:rPr>
           <w:rStyle w:val="PseudocodeChar"/>
         </w:rPr>
         <w:t>pendingDataSocket</w:t>
       </w:r>
+      <w:proofErr w:type="spellEnd"/>
       <w:r>
         <w:t xml:space="preserve"> and constructs the corresponding transport with the existing-socket constructor; for Active mode, it constructs the fresh-socket variant using the client's validated address. The session's mode state resets to </w:t>
       </w:r>
@@ -16432,12 +17368,14 @@
       <w:r>
         <w:t xml:space="preserve">This design deliberately keeps </w:t>
       </w:r>
+      <w:proofErr w:type="spellStart"/>
       <w:r>
         <w:rPr>
           <w:rStyle w:val="PseudocodeChar"/>
         </w:rPr>
         <w:t>ChunkedFileWriter</w:t>
       </w:r>
+      <w:proofErr w:type="spellEnd"/>
       <w:r>
         <w:t xml:space="preserve"> itself unmodified — it always just streams "the new data" into a temp file and atomically commits it, with no concept of "append" at all. The combination logic lives entirely in a separate step applied after a normal receive succeeds, at the cost of a second full-file copy for the existing content on a large append (once to seed the combined temp file, once already staged as new data) compared to a design that seeds the writer's temp file directly — a deliberate simplicity-over-I/O-efficiency tradeoff, not an oversight.</w:t>
       </w:r>
@@ -16485,7 +17423,15 @@
         <w:ind w:firstLine="357"/>
       </w:pPr>
       <w:r>
-        <w:t xml:space="preserve">The table below maps every major engineering component to its primary owner and supporting contributors, based on the team's original planning document and the project's commit history. Each member owned a distinct architectural layer for the full duration of the project; where teammates contributed to another member's layer, this is noted as supporting collaboration rather than a change of ownership, consistent with how the team worked throughout </w:t>
+        <w:t xml:space="preserve">The table below maps every major engineering component to its primary owner and supporting contributors, based on the team's original planning document and the project's </w:t>
+      </w:r>
+      <w:proofErr w:type="gramStart"/>
+      <w:r>
+        <w:t>commit history</w:t>
+      </w:r>
+      <w:proofErr w:type="gramEnd"/>
+      <w:r>
+        <w:t xml:space="preserve">. Each member owned a distinct architectural layer for the full duration of the project; where teammates contributed to another member's layer, this is noted as supporting collaboration rather than a change of ownership, consistent with how the team worked throughout </w:t>
       </w:r>
       <w:r>
         <w:t xml:space="preserve">– </w:t>
@@ -16987,9 +17933,11 @@
               <w:jc w:val="left"/>
               <w:cnfStyle w:val="000000100000" w:firstRow="0" w:lastRow="0" w:firstColumn="0" w:lastColumn="0" w:oddVBand="0" w:evenVBand="0" w:oddHBand="1" w:evenHBand="0" w:firstRowFirstColumn="0" w:firstRowLastColumn="0" w:lastRowFirstColumn="0" w:lastRowLastColumn="0"/>
             </w:pPr>
+            <w:proofErr w:type="spellStart"/>
             <w:r>
               <w:t>Đỗ</w:t>
             </w:r>
+            <w:proofErr w:type="spellEnd"/>
             <w:r>
               <w:rPr>
                 <w:lang w:val="vi-VN"/>
@@ -16997,7 +17945,15 @@
               <w:t xml:space="preserve"> Minh Khang </w:t>
             </w:r>
             <w:r>
-              <w:t>provided support with the underlying ChunkedFileWriter/atomic-commit design these commands build on</w:t>
+              <w:t xml:space="preserve">provided support with the underlying </w:t>
+            </w:r>
+            <w:proofErr w:type="spellStart"/>
+            <w:r>
+              <w:t>ChunkedFileWriter</w:t>
+            </w:r>
+            <w:proofErr w:type="spellEnd"/>
+            <w:r>
+              <w:t>/atomic-commit design these commands build on</w:t>
             </w:r>
           </w:p>
         </w:tc>
@@ -17020,7 +17976,15 @@
               <w:t>STOU</w:t>
             </w:r>
             <w:r>
-              <w:t>); non-destructive, atomically-committed appending to existing files (</w:t>
+              <w:t xml:space="preserve">); non-destructive, </w:t>
+            </w:r>
+            <w:proofErr w:type="gramStart"/>
+            <w:r>
+              <w:t>atomically-committed</w:t>
+            </w:r>
+            <w:proofErr w:type="gramEnd"/>
+            <w:r>
+              <w:t xml:space="preserve"> appending to existing files (</w:t>
             </w:r>
             <w:r>
               <w:rPr>
@@ -17084,9 +18048,11 @@
               <w:jc w:val="left"/>
               <w:cnfStyle w:val="000000000000" w:firstRow="0" w:lastRow="0" w:firstColumn="0" w:lastColumn="0" w:oddVBand="0" w:evenVBand="0" w:oddHBand="0" w:evenHBand="0" w:firstRowFirstColumn="0" w:firstRowLastColumn="0" w:lastRowFirstColumn="0" w:lastRowLastColumn="0"/>
             </w:pPr>
+            <w:proofErr w:type="spellStart"/>
             <w:r>
               <w:t>Đỗ</w:t>
             </w:r>
+            <w:proofErr w:type="spellEnd"/>
             <w:r>
               <w:rPr>
                 <w:lang w:val="vi-VN"/>
@@ -17110,12 +18076,14 @@
             <w:r>
               <w:t xml:space="preserve">Credential verification, per-client session fields, </w:t>
             </w:r>
+            <w:proofErr w:type="spellStart"/>
             <w:r>
               <w:rPr>
                 <w:rStyle w:val="PseudocodeChar"/>
               </w:rPr>
               <w:t>ClientRegistry</w:t>
             </w:r>
+            <w:proofErr w:type="spellEnd"/>
           </w:p>
         </w:tc>
       </w:tr>
@@ -17238,9 +18206,11 @@
                 <w:lang w:val="vi-VN"/>
               </w:rPr>
             </w:pPr>
+            <w:proofErr w:type="spellStart"/>
             <w:r>
               <w:t>Đỗ</w:t>
             </w:r>
+            <w:proofErr w:type="spellEnd"/>
             <w:r>
               <w:rPr>
                 <w:lang w:val="vi-VN"/>
@@ -17317,9 +18287,11 @@
               <w:jc w:val="left"/>
               <w:cnfStyle w:val="000000100000" w:firstRow="0" w:lastRow="0" w:firstColumn="0" w:lastColumn="0" w:oddVBand="0" w:evenVBand="0" w:oddHBand="1" w:evenHBand="0" w:firstRowFirstColumn="0" w:firstRowLastColumn="0" w:lastRowFirstColumn="0" w:lastRowLastColumn="0"/>
             </w:pPr>
+            <w:proofErr w:type="spellStart"/>
             <w:r>
               <w:t>Đỗ</w:t>
             </w:r>
+            <w:proofErr w:type="spellEnd"/>
             <w:r>
               <w:rPr>
                 <w:lang w:val="vi-VN"/>
@@ -17489,9 +18461,11 @@
               <w:jc w:val="left"/>
               <w:cnfStyle w:val="000000000000" w:firstRow="0" w:lastRow="0" w:firstColumn="0" w:lastColumn="0" w:oddVBand="0" w:evenVBand="0" w:oddHBand="0" w:evenHBand="0" w:firstRowFirstColumn="0" w:firstRowLastColumn="0" w:lastRowFirstColumn="0" w:lastRowLastColumn="0"/>
             </w:pPr>
+            <w:proofErr w:type="spellStart"/>
             <w:r>
               <w:t>Đỗ</w:t>
             </w:r>
+            <w:proofErr w:type="spellEnd"/>
             <w:r>
               <w:rPr>
                 <w:lang w:val="vi-VN"/>
@@ -17568,9 +18542,11 @@
               <w:jc w:val="left"/>
               <w:cnfStyle w:val="000000100000" w:firstRow="0" w:lastRow="0" w:firstColumn="0" w:lastColumn="0" w:oddVBand="0" w:evenVBand="0" w:oddHBand="1" w:evenHBand="0" w:firstRowFirstColumn="0" w:firstRowLastColumn="0" w:lastRowFirstColumn="0" w:lastRowLastColumn="0"/>
             </w:pPr>
+            <w:proofErr w:type="spellStart"/>
             <w:r>
               <w:t>Đỗ</w:t>
             </w:r>
+            <w:proofErr w:type="spellEnd"/>
             <w:r>
               <w:rPr>
                 <w:lang w:val="vi-VN"/>
@@ -17659,9 +18635,11 @@
               <w:jc w:val="left"/>
               <w:cnfStyle w:val="000000000000" w:firstRow="0" w:lastRow="0" w:firstColumn="0" w:lastColumn="0" w:oddVBand="0" w:evenVBand="0" w:oddHBand="0" w:evenHBand="0" w:firstRowFirstColumn="0" w:firstRowLastColumn="0" w:lastRowFirstColumn="0" w:lastRowLastColumn="0"/>
             </w:pPr>
+            <w:proofErr w:type="spellStart"/>
             <w:r>
               <w:t>Đỗ</w:t>
             </w:r>
+            <w:proofErr w:type="spellEnd"/>
             <w:r>
               <w:rPr>
                 <w:lang w:val="vi-VN"/>
@@ -17741,9 +18719,11 @@
                 <w:lang w:val="vi-VN"/>
               </w:rPr>
             </w:pPr>
+            <w:proofErr w:type="spellStart"/>
             <w:r>
               <w:t>Đỗ</w:t>
             </w:r>
+            <w:proofErr w:type="spellEnd"/>
             <w:r>
               <w:rPr>
                 <w:lang w:val="vi-VN"/>
@@ -17806,7 +18786,15 @@
               <w:cnfStyle w:val="000000100000" w:firstRow="0" w:lastRow="0" w:firstColumn="0" w:lastColumn="0" w:oddVBand="0" w:evenVBand="0" w:oddHBand="1" w:evenHBand="0" w:firstRowFirstColumn="0" w:firstRowLastColumn="0" w:lastRowFirstColumn="0" w:lastRowLastColumn="0"/>
             </w:pPr>
             <w:r>
-              <w:t>Bridges filesystem I/O and the RDT transport interface</w:t>
+              <w:t xml:space="preserve">Bridges </w:t>
+            </w:r>
+            <w:proofErr w:type="gramStart"/>
+            <w:r>
+              <w:t>filesystem</w:t>
+            </w:r>
+            <w:proofErr w:type="gramEnd"/>
+            <w:r>
+              <w:t xml:space="preserve"> I/O and the RDT transport interface</w:t>
             </w:r>
           </w:p>
         </w:tc>
@@ -17844,9 +18832,11 @@
               <w:jc w:val="left"/>
               <w:cnfStyle w:val="000000000000" w:firstRow="0" w:lastRow="0" w:firstColumn="0" w:lastColumn="0" w:oddVBand="0" w:evenVBand="0" w:oddHBand="0" w:evenHBand="0" w:firstRowFirstColumn="0" w:firstRowLastColumn="0" w:lastRowFirstColumn="0" w:lastRowLastColumn="0"/>
             </w:pPr>
+            <w:proofErr w:type="spellStart"/>
             <w:r>
               <w:t>Đỗ</w:t>
             </w:r>
+            <w:proofErr w:type="spellEnd"/>
             <w:r>
               <w:rPr>
                 <w:lang w:val="vi-VN"/>
@@ -17874,7 +18864,15 @@
               <w:t xml:space="preserve"> Hồng Hải Hoàng Lê</w:t>
             </w:r>
             <w:r>
-              <w:t xml:space="preserve"> provided support with control-layer integration (mode-toggle dispatch, portMatchesControlPeer validation)</w:t>
+              <w:t xml:space="preserve"> provided support with control-layer integration (mode-toggle dispatch, </w:t>
+            </w:r>
+            <w:proofErr w:type="spellStart"/>
+            <w:r>
+              <w:t>portMatchesControlPeer</w:t>
+            </w:r>
+            <w:proofErr w:type="spellEnd"/>
+            <w:r>
+              <w:t xml:space="preserve"> validation)</w:t>
             </w:r>
           </w:p>
         </w:tc>
@@ -17952,9 +18950,11 @@
               <w:jc w:val="left"/>
               <w:cnfStyle w:val="000000100000" w:firstRow="0" w:lastRow="0" w:firstColumn="0" w:lastColumn="0" w:oddVBand="0" w:evenVBand="0" w:oddHBand="1" w:evenHBand="0" w:firstRowFirstColumn="0" w:firstRowLastColumn="0" w:lastRowFirstColumn="0" w:lastRowLastColumn="0"/>
             </w:pPr>
+            <w:proofErr w:type="spellStart"/>
             <w:r>
               <w:t>Đỗ</w:t>
             </w:r>
+            <w:proofErr w:type="spellEnd"/>
             <w:r>
               <w:rPr>
                 <w:lang w:val="vi-VN"/>
@@ -18113,9 +19113,11 @@
               <w:jc w:val="left"/>
               <w:cnfStyle w:val="000000100000" w:firstRow="0" w:lastRow="0" w:firstColumn="0" w:lastColumn="0" w:oddVBand="0" w:evenVBand="0" w:oddHBand="1" w:evenHBand="0" w:firstRowFirstColumn="0" w:firstRowLastColumn="0" w:lastRowFirstColumn="0" w:lastRowLastColumn="0"/>
             </w:pPr>
+            <w:proofErr w:type="spellStart"/>
             <w:r>
               <w:t>Đỗ</w:t>
             </w:r>
+            <w:proofErr w:type="spellEnd"/>
             <w:r>
               <w:rPr>
                 <w:lang w:val="vi-VN"/>
@@ -18161,7 +19163,23 @@
                 <w:b w:val="0"/>
                 <w:bCs w:val="0"/>
               </w:rPr>
-              <w:t>Build system (CMake, library structure)</w:t>
+              <w:t>Build system (</w:t>
+            </w:r>
+            <w:proofErr w:type="spellStart"/>
+            <w:r>
+              <w:rPr>
+                <w:b w:val="0"/>
+                <w:bCs w:val="0"/>
+              </w:rPr>
+              <w:t>CMake</w:t>
+            </w:r>
+            <w:proofErr w:type="spellEnd"/>
+            <w:r>
+              <w:rPr>
+                <w:b w:val="0"/>
+                <w:bCs w:val="0"/>
+              </w:rPr>
+              <w:t>, library structure)</w:t>
             </w:r>
           </w:p>
         </w:tc>
@@ -18340,9 +19358,11 @@
               <w:jc w:val="left"/>
               <w:cnfStyle w:val="000000000000" w:firstRow="0" w:lastRow="0" w:firstColumn="0" w:lastColumn="0" w:oddVBand="0" w:evenVBand="0" w:oddHBand="0" w:evenHBand="0" w:firstRowFirstColumn="0" w:firstRowLastColumn="0" w:lastRowFirstColumn="0" w:lastRowLastColumn="0"/>
             </w:pPr>
+            <w:proofErr w:type="spellStart"/>
             <w:r>
               <w:t>Đỗ</w:t>
             </w:r>
+            <w:proofErr w:type="spellEnd"/>
             <w:r>
               <w:rPr>
                 <w:lang w:val="vi-VN"/>
@@ -18427,14 +19447,31 @@
           <w:bCs/>
           <w:lang w:val="vi-VN"/>
         </w:rPr>
-        <w:t xml:space="preserve"> Hồng Hải Hoàng Lê –  </w:t>
-      </w:r>
+        <w:t xml:space="preserve"> Hồng Hải Hoàng Lê </w:t>
+      </w:r>
+      <w:proofErr w:type="gramStart"/>
       <w:r>
         <w:rPr>
           <w:b/>
           <w:bCs/>
-        </w:rPr>
-        <w:t>Control &amp; Session Layer.</w:t>
+          <w:lang w:val="vi-VN"/>
+        </w:rPr>
+        <w:t xml:space="preserve">–  </w:t>
+      </w:r>
+      <w:r>
+        <w:rPr>
+          <w:b/>
+          <w:bCs/>
+        </w:rPr>
+        <w:t>Control</w:t>
+      </w:r>
+      <w:proofErr w:type="gramEnd"/>
+      <w:r>
+        <w:rPr>
+          <w:b/>
+          <w:bCs/>
+        </w:rPr>
+        <w:t xml:space="preserve"> &amp; Session Layer.</w:t>
       </w:r>
       <w:r>
         <w:t xml:space="preserve"> </w:t>
@@ -18527,6 +19564,7 @@
       </w:r>
     </w:p>
     <w:p>
+      <w:proofErr w:type="spellStart"/>
       <w:r>
         <w:rPr>
           <w:b/>
@@ -18534,6 +19572,7 @@
         </w:rPr>
         <w:t>Đỗ</w:t>
       </w:r>
+      <w:proofErr w:type="spellEnd"/>
       <w:r>
         <w:rPr>
           <w:b/>
@@ -18614,9 +19653,6 @@
           <w:ilvl w:val="1"/>
           <w:numId w:val="1"/>
         </w:numPr>
-        <w:rPr>
-          <w:lang w:val="vi-VN"/>
-        </w:rPr>
       </w:pPr>
       <w:bookmarkStart w:id="36" w:name="_Toc237102655"/>
       <w:r>
@@ -18626,6 +19662,252 @@
         <w:t>Lâm Hồng Hải Hoàng Lê</w:t>
       </w:r>
       <w:bookmarkEnd w:id="36"/>
+    </w:p>
+    <w:p>
+      <w:pPr>
+        <w:pStyle w:val="Heading3"/>
+        <w:numPr>
+          <w:ilvl w:val="2"/>
+          <w:numId w:val="1"/>
+        </w:numPr>
+      </w:pPr>
+      <w:r>
+        <w:t>Self-Assessment</w:t>
+      </w:r>
+    </w:p>
+    <w:p>
+      <w:pPr>
+        <w:ind w:firstLine="357"/>
+      </w:pPr>
+      <w:r>
+        <w:t xml:space="preserve">For this project, </w:t>
+      </w:r>
+      <w:r>
+        <w:t>my primary responsibility</w:t>
+      </w:r>
+      <w:r>
+        <w:t xml:space="preserve"> </w:t>
+      </w:r>
+      <w:r>
+        <w:t>was designing and</w:t>
+      </w:r>
+      <w:r>
+        <w:t xml:space="preserve"> implementing the </w:t>
+      </w:r>
+      <w:r>
+        <w:t xml:space="preserve">server-client </w:t>
+      </w:r>
+      <w:r>
+        <w:t xml:space="preserve">control channel. </w:t>
+      </w:r>
+      <w:r>
+        <w:t xml:space="preserve">Although I initially faced a steep learning curve regarding </w:t>
+      </w:r>
+      <w:r>
+        <w:t xml:space="preserve">the knowledge of the TCP protocol, I believe I have done sufficient work to </w:t>
+      </w:r>
+      <w:r>
+        <w:t>deliver functional core components and contribute</w:t>
+      </w:r>
+      <w:r>
+        <w:t xml:space="preserve"> meaningfully to the project. After </w:t>
+      </w:r>
+      <w:r>
+        <w:t>the completion of the program by everyone</w:t>
+      </w:r>
+      <w:r>
+        <w:t xml:space="preserve">, I </w:t>
+      </w:r>
+      <w:r>
+        <w:t>conducted thorough system testing to identify remaining issues and report back to my teammates</w:t>
+      </w:r>
+      <w:r>
+        <w:t>.</w:t>
+      </w:r>
+    </w:p>
+    <w:p>
+      <w:pPr>
+        <w:ind w:firstLine="357"/>
+      </w:pPr>
+      <w:r>
+        <w:t xml:space="preserve">During the process, I have recognized </w:t>
+      </w:r>
+      <w:r>
+        <w:t>some of my limitations</w:t>
+      </w:r>
+      <w:r>
+        <w:t xml:space="preserve"> in terms of </w:t>
+      </w:r>
+      <w:r>
+        <w:t>the</w:t>
+      </w:r>
+      <w:r>
+        <w:t xml:space="preserve"> speed</w:t>
+      </w:r>
+      <w:r>
+        <w:t xml:space="preserve"> I was progressing in</w:t>
+      </w:r>
+      <w:r>
+        <w:t xml:space="preserve"> and</w:t>
+      </w:r>
+      <w:r>
+        <w:t xml:space="preserve"> my initial efficiency in</w:t>
+      </w:r>
+      <w:r>
+        <w:t xml:space="preserve"> </w:t>
+      </w:r>
+      <w:r>
+        <w:t>software development tools</w:t>
+      </w:r>
+      <w:r>
+        <w:t xml:space="preserve">. </w:t>
+      </w:r>
+      <w:r>
+        <w:t>Even though t</w:t>
+      </w:r>
+      <w:r>
+        <w:t>his slightly hindered our group’s progress</w:t>
+      </w:r>
+      <w:r>
+        <w:t>,</w:t>
+      </w:r>
+      <w:r>
+        <w:t xml:space="preserve"> </w:t>
+      </w:r>
+      <w:r>
+        <w:t xml:space="preserve">the experience highlighted the importance of workflow optimization, and </w:t>
+      </w:r>
+      <w:r>
+        <w:t xml:space="preserve">I have learned to utilize more of the available </w:t>
+      </w:r>
+      <w:r>
+        <w:t>tools and resources</w:t>
+      </w:r>
+      <w:r>
+        <w:t xml:space="preserve"> to </w:t>
+      </w:r>
+      <w:r>
+        <w:t>improve our collaboration during the last few days of the project.</w:t>
+      </w:r>
+    </w:p>
+    <w:p>
+      <w:pPr>
+        <w:pStyle w:val="Heading3"/>
+        <w:numPr>
+          <w:ilvl w:val="2"/>
+          <w:numId w:val="1"/>
+        </w:numPr>
+        <w:rPr>
+          <w:lang w:val="vi-VN"/>
+        </w:rPr>
+      </w:pPr>
+      <w:r>
+        <w:t xml:space="preserve"> </w:t>
+      </w:r>
+      <w:r>
+        <w:t>Peer Evaluation</w:t>
+      </w:r>
+    </w:p>
+    <w:p>
+      <w:pPr>
+        <w:ind w:firstLine="357"/>
+      </w:pPr>
+      <w:r>
+        <w:t xml:space="preserve">As our leader, </w:t>
+      </w:r>
+      <w:proofErr w:type="spellStart"/>
+      <w:r>
+        <w:t>Đỗ</w:t>
+      </w:r>
+      <w:proofErr w:type="spellEnd"/>
+      <w:r>
+        <w:t xml:space="preserve"> Minh Khang</w:t>
+      </w:r>
+      <w:r>
+        <w:t xml:space="preserve"> demonstrated exceptional project leadership by establishing </w:t>
+      </w:r>
+      <w:r>
+        <w:t>a clear and well-defined structure</w:t>
+      </w:r>
+      <w:r>
+        <w:t xml:space="preserve"> </w:t>
+      </w:r>
+      <w:r>
+        <w:t xml:space="preserve">to the project </w:t>
+      </w:r>
+      <w:r>
+        <w:t xml:space="preserve">and </w:t>
+      </w:r>
+      <w:r>
+        <w:t>assigning each task to a suitable teammate</w:t>
+      </w:r>
+      <w:r>
+        <w:t xml:space="preserve">. His strategic </w:t>
+      </w:r>
+      <w:r>
+        <w:t>skills</w:t>
+      </w:r>
+      <w:r>
+        <w:t xml:space="preserve"> were instrumental in allowing the team to </w:t>
+      </w:r>
+      <w:r>
+        <w:t>finish the project</w:t>
+      </w:r>
+      <w:r>
+        <w:t xml:space="preserve"> within a tight schedule.</w:t>
+      </w:r>
+    </w:p>
+    <w:p>
+      <w:pPr>
+        <w:ind w:firstLine="357"/>
+      </w:pPr>
+      <w:r>
+        <w:t xml:space="preserve">Mai Phúc </w:t>
+      </w:r>
+      <w:proofErr w:type="spellStart"/>
+      <w:r>
+        <w:t>Hưng</w:t>
+      </w:r>
+      <w:proofErr w:type="spellEnd"/>
+      <w:r>
+        <w:t xml:space="preserve"> provided invaluable collaborative support during the integration </w:t>
+      </w:r>
+      <w:r>
+        <w:t>phase</w:t>
+      </w:r>
+      <w:r>
+        <w:t xml:space="preserve">, working closely with </w:t>
+      </w:r>
+      <w:r>
+        <w:t>Khang</w:t>
+      </w:r>
+      <w:r>
+        <w:t xml:space="preserve"> and myself to seamlessly interface his modules with the rest of the application. </w:t>
+      </w:r>
+      <w:r>
+        <w:t>His ability to utilize his</w:t>
+      </w:r>
+      <w:r>
+        <w:t xml:space="preserve"> development tools</w:t>
+      </w:r>
+      <w:r>
+        <w:t xml:space="preserve"> to the utmost</w:t>
+      </w:r>
+      <w:r>
+        <w:t xml:space="preserve"> was reflected in the </w:t>
+      </w:r>
+      <w:r>
+        <w:t>reliable, high-quality</w:t>
+      </w:r>
+      <w:r>
+        <w:t xml:space="preserve"> code he produced for the final system release.</w:t>
+      </w:r>
+      <w:r>
+        <w:t xml:space="preserve"> </w:t>
+      </w:r>
+      <w:r>
+        <w:t xml:space="preserve"> </w:t>
+      </w:r>
     </w:p>
     <w:p>
       <w:pPr>
@@ -18681,7 +19963,15 @@
         </w:rPr>
       </w:pPr>
       <w:r>
-        <w:t>One important part of my work was debugging the RDT tests. For example, I encountered an issue related to the verification checksum of a serialized header. I reviewed the implementation, corrected the problem, and reran the test until the RdtTest passed successfully. This process helped me better understand how reliable data transfer works and how important careful serialization, checksum handling, and testing are in network programming.</w:t>
+        <w:t xml:space="preserve">One important part of my work was debugging the RDT tests. For example, I encountered an issue related to the verification checksum of a serialized header. I reviewed the implementation, corrected the problem, and reran the test until the </w:t>
+      </w:r>
+      <w:proofErr w:type="spellStart"/>
+      <w:r>
+        <w:t>RdtTest</w:t>
+      </w:r>
+      <w:proofErr w:type="spellEnd"/>
+      <w:r>
+        <w:t xml:space="preserve"> passed successfully. This process helped me better understand how reliable data transfer works and how important careful serialization, checksum handling, and testing are in network programming.</w:t>
       </w:r>
     </w:p>
     <w:p>
@@ -18692,7 +19982,11 @@
         </w:rPr>
       </w:pPr>
       <w:r>
-        <w:t>I also worked to make sure that my implementation could integrate correctly with the other parts of the client-server system. Throughout the project, I improved my C++ programming, debugging, testing, and problem-solving skills. I also became more familiar with working in a team where different members are responsible for different components of the same system.</w:t>
+        <w:t xml:space="preserve">I also worked to make sure that my implementation could integrate correctly with the other parts of the client-server system. Throughout the project, I improved my C++ programming, </w:t>
+      </w:r>
+      <w:r>
+        <w:lastRenderedPageBreak/>
+        <w:t>debugging, testing, and problem-solving skills. I also became more familiar with working in a team where different members are responsible for different components of the same system.</w:t>
       </w:r>
     </w:p>
     <w:p>
@@ -18774,7 +20068,6 @@
         <w:rPr>
           <w:lang w:val="vi-VN"/>
         </w:rPr>
-        <w:lastRenderedPageBreak/>
         <w:t>Đỗ Minh Khang</w:t>
       </w:r>
       <w:bookmarkEnd w:id="38"/>
@@ -18857,7 +20150,14 @@
         <w:rPr>
           <w:lang w:val="vi-VN"/>
         </w:rPr>
-        <w:t>demonstrated a genuine commitment to understanding his assigned responsibilities and the technical aspects of his modules. Although he occasionally progressed more slowly than planned, he maintained a solid understanding of his tasks, and the quality of his code was consistently high.</w:t>
+        <w:t xml:space="preserve">demonstrated a genuine commitment to understanding his assigned responsibilities and the technical aspects of his modules. Although he </w:t>
+      </w:r>
+      <w:r>
+        <w:rPr>
+          <w:lang w:val="vi-VN"/>
+        </w:rPr>
+        <w:lastRenderedPageBreak/>
+        <w:t>occasionally progressed more slowly than planned, he maintained a solid understanding of his tasks, and the quality of his code was consistently high.</w:t>
       </w:r>
     </w:p>
     <w:p>
@@ -19315,6 +20615,7 @@
         <w:rPr>
           <w:lang w:val="vi-VN"/>
         </w:rPr>
+        <w:lastRenderedPageBreak/>
         <w:t>Đỗ Minh Khang’s log:</w:t>
       </w:r>
       <w:r>
@@ -19331,9 +20632,6 @@
           <w:ilvl w:val="0"/>
           <w:numId w:val="1"/>
         </w:numPr>
-        <w:rPr>
-          <w:lang w:val="vi-VN"/>
-        </w:rPr>
       </w:pPr>
       <w:bookmarkStart w:id="41" w:name="_Toc237102660"/>
       <w:r>
@@ -19341,6 +20639,444 @@
       </w:r>
       <w:bookmarkEnd w:id="41"/>
     </w:p>
+    <w:p/>
+    <w:p>
+      <w:r>
+        <w:drawing>
+          <wp:inline distT="0" distB="0" distL="0" distR="0" wp14:anchorId="395E031F" wp14:editId="52E33A6E">
+            <wp:extent cx="5928360" cy="3512820"/>
+            <wp:effectExtent l="0" t="0" r="0" b="0"/>
+            <wp:docPr id="1356372844" name="Picture 20"/>
+            <wp:cNvGraphicFramePr>
+              <a:graphicFrameLocks xmlns:a="http://schemas.openxmlformats.org/drawingml/2006/main" noChangeAspect="1"/>
+            </wp:cNvGraphicFramePr>
+            <a:graphic xmlns:a="http://schemas.openxmlformats.org/drawingml/2006/main">
+              <a:graphicData uri="http://schemas.openxmlformats.org/drawingml/2006/picture">
+                <pic:pic xmlns:pic="http://schemas.openxmlformats.org/drawingml/2006/picture">
+                  <pic:nvPicPr>
+                    <pic:cNvPr id="0" name="Picture 1"/>
+                    <pic:cNvPicPr>
+                      <a:picLocks noChangeAspect="1" noChangeArrowheads="1"/>
+                    </pic:cNvPicPr>
+                  </pic:nvPicPr>
+                  <pic:blipFill>
+                    <a:blip r:embed="rId20" cstate="print">
+                      <a:extLst>
+                        <a:ext uri="{28A0092B-C50C-407E-A947-70E740481C1C}">
+                          <a14:useLocalDpi xmlns:a14="http://schemas.microsoft.com/office/drawing/2010/main" val="0"/>
+                        </a:ext>
+                      </a:extLst>
+                    </a:blip>
+                    <a:srcRect/>
+                    <a:stretch>
+                      <a:fillRect/>
+                    </a:stretch>
+                  </pic:blipFill>
+                  <pic:spPr bwMode="auto">
+                    <a:xfrm>
+                      <a:off x="0" y="0"/>
+                      <a:ext cx="5928360" cy="3512820"/>
+                    </a:xfrm>
+                    <a:prstGeom prst="rect">
+                      <a:avLst/>
+                    </a:prstGeom>
+                    <a:noFill/>
+                    <a:ln>
+                      <a:noFill/>
+                    </a:ln>
+                  </pic:spPr>
+                </pic:pic>
+              </a:graphicData>
+            </a:graphic>
+          </wp:inline>
+        </w:drawing>
+      </w:r>
+    </w:p>
+    <w:p>
+      <w:pPr>
+        <w:jc w:val="center"/>
+        <w:rPr>
+          <w:i/>
+          <w:iCs/>
+          <w:color w:val="44546A" w:themeColor="text2"/>
+          <w:sz w:val="18"/>
+          <w:szCs w:val="18"/>
+        </w:rPr>
+      </w:pPr>
+      <w:r>
+        <w:rPr>
+          <w:i/>
+          <w:iCs/>
+          <w:color w:val="44546A" w:themeColor="text2"/>
+          <w:sz w:val="18"/>
+          <w:szCs w:val="18"/>
+        </w:rPr>
+        <w:t>Figure A: The server and client programs after being started up. Two clients are connected to the server.</w:t>
+      </w:r>
+    </w:p>
+    <w:p>
+      <w:pPr>
+        <w:rPr>
+          <w:i/>
+          <w:iCs/>
+        </w:rPr>
+      </w:pPr>
+      <w:r>
+        <w:rPr>
+          <w:i/>
+          <w:iCs/>
+        </w:rPr>
+        <w:lastRenderedPageBreak/>
+        <w:drawing>
+          <wp:inline distT="0" distB="0" distL="0" distR="0" wp14:anchorId="66AA96C6" wp14:editId="52DBBCB5">
+            <wp:extent cx="5928360" cy="3497580"/>
+            <wp:effectExtent l="0" t="0" r="0" b="7620"/>
+            <wp:docPr id="950035153" name="Picture 19"/>
+            <wp:cNvGraphicFramePr>
+              <a:graphicFrameLocks xmlns:a="http://schemas.openxmlformats.org/drawingml/2006/main" noChangeAspect="1"/>
+            </wp:cNvGraphicFramePr>
+            <a:graphic xmlns:a="http://schemas.openxmlformats.org/drawingml/2006/main">
+              <a:graphicData uri="http://schemas.openxmlformats.org/drawingml/2006/picture">
+                <pic:pic xmlns:pic="http://schemas.openxmlformats.org/drawingml/2006/picture">
+                  <pic:nvPicPr>
+                    <pic:cNvPr id="0" name="Picture 3"/>
+                    <pic:cNvPicPr>
+                      <a:picLocks noChangeAspect="1" noChangeArrowheads="1"/>
+                    </pic:cNvPicPr>
+                  </pic:nvPicPr>
+                  <pic:blipFill>
+                    <a:blip r:embed="rId21" cstate="print">
+                      <a:extLst>
+                        <a:ext uri="{28A0092B-C50C-407E-A947-70E740481C1C}">
+                          <a14:useLocalDpi xmlns:a14="http://schemas.microsoft.com/office/drawing/2010/main" val="0"/>
+                        </a:ext>
+                      </a:extLst>
+                    </a:blip>
+                    <a:srcRect/>
+                    <a:stretch>
+                      <a:fillRect/>
+                    </a:stretch>
+                  </pic:blipFill>
+                  <pic:spPr bwMode="auto">
+                    <a:xfrm>
+                      <a:off x="0" y="0"/>
+                      <a:ext cx="5928360" cy="3497580"/>
+                    </a:xfrm>
+                    <a:prstGeom prst="rect">
+                      <a:avLst/>
+                    </a:prstGeom>
+                    <a:noFill/>
+                    <a:ln>
+                      <a:noFill/>
+                    </a:ln>
+                  </pic:spPr>
+                </pic:pic>
+              </a:graphicData>
+            </a:graphic>
+          </wp:inline>
+        </w:drawing>
+      </w:r>
+      <w:r>
+        <w:rPr>
+          <w:i/>
+          <w:iCs/>
+        </w:rPr>
+        <w:t xml:space="preserve"> </w:t>
+      </w:r>
+    </w:p>
+    <w:p>
+      <w:pPr>
+        <w:jc w:val="center"/>
+        <w:rPr>
+          <w:i/>
+          <w:iCs/>
+          <w:color w:val="44546A" w:themeColor="text2"/>
+          <w:sz w:val="18"/>
+          <w:szCs w:val="18"/>
+        </w:rPr>
+      </w:pPr>
+      <w:r>
+        <w:rPr>
+          <w:i/>
+          <w:iCs/>
+          <w:color w:val="44546A" w:themeColor="text2"/>
+          <w:sz w:val="18"/>
+          <w:szCs w:val="18"/>
+        </w:rPr>
+        <w:t>Figure B: Clients logging in via the USER and PASS commands.</w:t>
+      </w:r>
+    </w:p>
+    <w:p>
+      <w:pPr>
+        <w:rPr>
+          <w:i/>
+          <w:iCs/>
+        </w:rPr>
+      </w:pPr>
+      <w:r>
+        <w:rPr>
+          <w:i/>
+          <w:iCs/>
+        </w:rPr>
+        <w:drawing>
+          <wp:inline distT="0" distB="0" distL="0" distR="0" wp14:anchorId="396713F4" wp14:editId="213E9B30">
+            <wp:extent cx="5943600" cy="3535680"/>
+            <wp:effectExtent l="0" t="0" r="0" b="7620"/>
+            <wp:docPr id="792500903" name="Picture 18"/>
+            <wp:cNvGraphicFramePr>
+              <a:graphicFrameLocks xmlns:a="http://schemas.openxmlformats.org/drawingml/2006/main" noChangeAspect="1"/>
+            </wp:cNvGraphicFramePr>
+            <a:graphic xmlns:a="http://schemas.openxmlformats.org/drawingml/2006/main">
+              <a:graphicData uri="http://schemas.openxmlformats.org/drawingml/2006/picture">
+                <pic:pic xmlns:pic="http://schemas.openxmlformats.org/drawingml/2006/picture">
+                  <pic:nvPicPr>
+                    <pic:cNvPr id="0" name="Picture 4"/>
+                    <pic:cNvPicPr>
+                      <a:picLocks noChangeAspect="1" noChangeArrowheads="1"/>
+                    </pic:cNvPicPr>
+                  </pic:nvPicPr>
+                  <pic:blipFill>
+                    <a:blip r:embed="rId22">
+                      <a:extLst>
+                        <a:ext uri="{28A0092B-C50C-407E-A947-70E740481C1C}">
+                          <a14:useLocalDpi xmlns:a14="http://schemas.microsoft.com/office/drawing/2010/main" val="0"/>
+                        </a:ext>
+                      </a:extLst>
+                    </a:blip>
+                    <a:srcRect/>
+                    <a:stretch>
+                      <a:fillRect/>
+                    </a:stretch>
+                  </pic:blipFill>
+                  <pic:spPr bwMode="auto">
+                    <a:xfrm>
+                      <a:off x="0" y="0"/>
+                      <a:ext cx="5943600" cy="3535680"/>
+                    </a:xfrm>
+                    <a:prstGeom prst="rect">
+                      <a:avLst/>
+                    </a:prstGeom>
+                    <a:noFill/>
+                    <a:ln>
+                      <a:noFill/>
+                    </a:ln>
+                  </pic:spPr>
+                </pic:pic>
+              </a:graphicData>
+            </a:graphic>
+          </wp:inline>
+        </w:drawing>
+      </w:r>
+    </w:p>
+    <w:p>
+      <w:pPr>
+        <w:jc w:val="center"/>
+        <w:rPr>
+          <w:i/>
+          <w:iCs/>
+          <w:color w:val="44546A" w:themeColor="text2"/>
+          <w:sz w:val="18"/>
+          <w:szCs w:val="18"/>
+        </w:rPr>
+      </w:pPr>
+      <w:r>
+        <w:rPr>
+          <w:i/>
+          <w:iCs/>
+          <w:color w:val="44546A" w:themeColor="text2"/>
+          <w:sz w:val="18"/>
+          <w:szCs w:val="18"/>
+        </w:rPr>
+        <w:t>Figure C: Client can execute HELP, NOOP and QUIT commands without being logged in. Other commands, such as PASV, cannot be executed without logging in using USER and PASS.</w:t>
+      </w:r>
+    </w:p>
+    <w:p/>
+    <w:p>
+      <w:pPr>
+        <w:rPr>
+          <w:i/>
+          <w:iCs/>
+        </w:rPr>
+      </w:pPr>
+      <w:r>
+        <w:rPr>
+          <w:i/>
+          <w:iCs/>
+        </w:rPr>
+        <w:lastRenderedPageBreak/>
+        <w:drawing>
+          <wp:inline distT="0" distB="0" distL="0" distR="0" wp14:anchorId="4275524E" wp14:editId="7C8469BB">
+            <wp:extent cx="5935980" cy="3924300"/>
+            <wp:effectExtent l="0" t="0" r="7620" b="0"/>
+            <wp:docPr id="2192607" name="Picture 17"/>
+            <wp:cNvGraphicFramePr>
+              <a:graphicFrameLocks xmlns:a="http://schemas.openxmlformats.org/drawingml/2006/main" noChangeAspect="1"/>
+            </wp:cNvGraphicFramePr>
+            <a:graphic xmlns:a="http://schemas.openxmlformats.org/drawingml/2006/main">
+              <a:graphicData uri="http://schemas.openxmlformats.org/drawingml/2006/picture">
+                <pic:pic xmlns:pic="http://schemas.openxmlformats.org/drawingml/2006/picture">
+                  <pic:nvPicPr>
+                    <pic:cNvPr id="0" name="Picture 9"/>
+                    <pic:cNvPicPr>
+                      <a:picLocks noChangeAspect="1" noChangeArrowheads="1"/>
+                    </pic:cNvPicPr>
+                  </pic:nvPicPr>
+                  <pic:blipFill>
+                    <a:blip r:embed="rId23">
+                      <a:extLst>
+                        <a:ext uri="{28A0092B-C50C-407E-A947-70E740481C1C}">
+                          <a14:useLocalDpi xmlns:a14="http://schemas.microsoft.com/office/drawing/2010/main" val="0"/>
+                        </a:ext>
+                      </a:extLst>
+                    </a:blip>
+                    <a:srcRect/>
+                    <a:stretch>
+                      <a:fillRect/>
+                    </a:stretch>
+                  </pic:blipFill>
+                  <pic:spPr bwMode="auto">
+                    <a:xfrm>
+                      <a:off x="0" y="0"/>
+                      <a:ext cx="5935980" cy="3924300"/>
+                    </a:xfrm>
+                    <a:prstGeom prst="rect">
+                      <a:avLst/>
+                    </a:prstGeom>
+                    <a:noFill/>
+                    <a:ln>
+                      <a:noFill/>
+                    </a:ln>
+                  </pic:spPr>
+                </pic:pic>
+              </a:graphicData>
+            </a:graphic>
+          </wp:inline>
+        </w:drawing>
+      </w:r>
+      <w:r>
+        <w:rPr>
+          <w:i/>
+          <w:iCs/>
+        </w:rPr>
+        <w:t xml:space="preserve"> </w:t>
+      </w:r>
+    </w:p>
+    <w:p>
+      <w:pPr>
+        <w:jc w:val="center"/>
+        <w:rPr>
+          <w:i/>
+          <w:iCs/>
+          <w:color w:val="44546A" w:themeColor="text2"/>
+          <w:sz w:val="18"/>
+          <w:szCs w:val="18"/>
+        </w:rPr>
+      </w:pPr>
+      <w:r>
+        <w:rPr>
+          <w:i/>
+          <w:iCs/>
+          <w:color w:val="44546A" w:themeColor="text2"/>
+          <w:sz w:val="18"/>
+          <w:szCs w:val="18"/>
+        </w:rPr>
+        <w:t>Figure D: Client can execute control-only commands, such as PWD, CWD, CDUP, LIST, MKD, SIZE, STAT.</w:t>
+      </w:r>
+    </w:p>
+    <w:p>
+      <w:pPr>
+        <w:rPr>
+          <w:i/>
+          <w:iCs/>
+        </w:rPr>
+      </w:pPr>
+      <w:r>
+        <w:rPr>
+          <w:i/>
+          <w:iCs/>
+          <w:lang w:val="vi-VN"/>
+        </w:rPr>
+        <w:drawing>
+          <wp:inline distT="0" distB="0" distL="0" distR="0" wp14:anchorId="29E34BEF" wp14:editId="0C331647">
+            <wp:extent cx="5928360" cy="3512820"/>
+            <wp:effectExtent l="0" t="0" r="0" b="0"/>
+            <wp:docPr id="156565457" name="Picture 16"/>
+            <wp:cNvGraphicFramePr>
+              <a:graphicFrameLocks xmlns:a="http://schemas.openxmlformats.org/drawingml/2006/main" noChangeAspect="1"/>
+            </wp:cNvGraphicFramePr>
+            <a:graphic xmlns:a="http://schemas.openxmlformats.org/drawingml/2006/main">
+              <a:graphicData uri="http://schemas.openxmlformats.org/drawingml/2006/picture">
+                <pic:pic xmlns:pic="http://schemas.openxmlformats.org/drawingml/2006/picture">
+                  <pic:nvPicPr>
+                    <pic:cNvPr id="0" name="Picture 6"/>
+                    <pic:cNvPicPr>
+                      <a:picLocks noChangeAspect="1" noChangeArrowheads="1"/>
+                    </pic:cNvPicPr>
+                  </pic:nvPicPr>
+                  <pic:blipFill>
+                    <a:blip r:embed="rId24">
+                      <a:extLst>
+                        <a:ext uri="{28A0092B-C50C-407E-A947-70E740481C1C}">
+                          <a14:useLocalDpi xmlns:a14="http://schemas.microsoft.com/office/drawing/2010/main" val="0"/>
+                        </a:ext>
+                      </a:extLst>
+                    </a:blip>
+                    <a:srcRect/>
+                    <a:stretch>
+                      <a:fillRect/>
+                    </a:stretch>
+                  </pic:blipFill>
+                  <pic:spPr bwMode="auto">
+                    <a:xfrm>
+                      <a:off x="0" y="0"/>
+                      <a:ext cx="5928360" cy="3512820"/>
+                    </a:xfrm>
+                    <a:prstGeom prst="rect">
+                      <a:avLst/>
+                    </a:prstGeom>
+                    <a:noFill/>
+                    <a:ln>
+                      <a:noFill/>
+                    </a:ln>
+                  </pic:spPr>
+                </pic:pic>
+              </a:graphicData>
+            </a:graphic>
+          </wp:inline>
+        </w:drawing>
+      </w:r>
+      <w:r>
+        <w:rPr>
+          <w:i/>
+          <w:iCs/>
+          <w:lang w:val="vi-VN"/>
+        </w:rPr>
+        <w:t xml:space="preserve"> </w:t>
+      </w:r>
+    </w:p>
+    <w:p>
+      <w:pPr>
+        <w:jc w:val="center"/>
+        <w:rPr>
+          <w:i/>
+          <w:iCs/>
+          <w:color w:val="44546A" w:themeColor="text2"/>
+          <w:sz w:val="18"/>
+          <w:szCs w:val="18"/>
+        </w:rPr>
+      </w:pPr>
+      <w:r>
+        <w:rPr>
+          <w:i/>
+          <w:iCs/>
+          <w:color w:val="44546A" w:themeColor="text2"/>
+          <w:sz w:val="18"/>
+          <w:szCs w:val="18"/>
+        </w:rPr>
+        <w:t>Figure E: Clients enter Passive Mode using PASV. While a client sends a large file to the server, another client can retrieve a file from the server without affecting the other client.</w:t>
+      </w:r>
+    </w:p>
+    <w:p/>
     <w:p>
       <w:pPr>
         <w:pStyle w:val="Heading1"/>
@@ -19373,8 +21109,8 @@
       </w:pPr>
     </w:p>
     <w:sectPr>
-      <w:headerReference w:type="default" r:id="rId20"/>
-      <w:footerReference w:type="default" r:id="rId21"/>
+      <w:headerReference w:type="default" r:id="rId25"/>
+      <w:footerReference w:type="default" r:id="rId26"/>
       <w:pgSz w:w="12240" w:h="15840"/>
       <w:pgMar w:top="1440" w:right="1440" w:bottom="1440" w:left="1440" w:header="720" w:footer="720" w:gutter="0"/>
       <w:pgNumType w:start="0"/>

</xml_diff>

<commit_message>
docs: more demo images to report
</commit_message>
<xml_diff>
--- a/docs/report.docx
+++ b/docs/report.docx
@@ -20639,11 +20639,13 @@
       </w:r>
       <w:bookmarkEnd w:id="41"/>
     </w:p>
-    <w:p/>
     <w:p>
       <w:r>
+        <w:rPr>
+          <w:noProof/>
+        </w:rPr>
         <w:drawing>
-          <wp:inline distT="0" distB="0" distL="0" distR="0" wp14:anchorId="395E031F" wp14:editId="52E33A6E">
+          <wp:inline distT="0" distB="0" distL="0" distR="0" wp14:anchorId="395E031F" wp14:editId="23308475">
             <wp:extent cx="5928360" cy="3512820"/>
             <wp:effectExtent l="0" t="0" r="0" b="0"/>
             <wp:docPr id="1356372844" name="Picture 20"/>
@@ -20725,10 +20727,10 @@
         <w:rPr>
           <w:i/>
           <w:iCs/>
-        </w:rPr>
-        <w:lastRenderedPageBreak/>
+          <w:noProof/>
+        </w:rPr>
         <w:drawing>
-          <wp:inline distT="0" distB="0" distL="0" distR="0" wp14:anchorId="66AA96C6" wp14:editId="52DBBCB5">
+          <wp:inline distT="0" distB="0" distL="0" distR="0" wp14:anchorId="66AA96C6" wp14:editId="25BB72D1">
             <wp:extent cx="5928360" cy="3497580"/>
             <wp:effectExtent l="0" t="0" r="0" b="7620"/>
             <wp:docPr id="950035153" name="Picture 19"/>
@@ -20803,6 +20805,7 @@
           <w:sz w:val="18"/>
           <w:szCs w:val="18"/>
         </w:rPr>
+        <w:lastRenderedPageBreak/>
         <w:t>Figure B: Clients logging in via the USER and PASS commands.</w:t>
       </w:r>
     </w:p>
@@ -20817,6 +20820,7 @@
         <w:rPr>
           <w:i/>
           <w:iCs/>
+          <w:noProof/>
         </w:rPr>
         <w:drawing>
           <wp:inline distT="0" distB="0" distL="0" distR="0" wp14:anchorId="396713F4" wp14:editId="213E9B30">
@@ -20890,9 +20894,9 @@
         <w:t>Figure C: Client can execute HELP, NOOP and QUIT commands without being logged in. Other commands, such as PASV, cannot be executed without logging in using USER and PASS.</w:t>
       </w:r>
     </w:p>
-    <w:p/>
     <w:p>
       <w:pPr>
+        <w:jc w:val="center"/>
         <w:rPr>
           <w:i/>
           <w:iCs/>
@@ -20902,12 +20906,12 @@
         <w:rPr>
           <w:i/>
           <w:iCs/>
-        </w:rPr>
-        <w:lastRenderedPageBreak/>
+          <w:noProof/>
+        </w:rPr>
         <w:drawing>
-          <wp:inline distT="0" distB="0" distL="0" distR="0" wp14:anchorId="4275524E" wp14:editId="7C8469BB">
-            <wp:extent cx="5935980" cy="3924300"/>
-            <wp:effectExtent l="0" t="0" r="7620" b="0"/>
+          <wp:inline distT="0" distB="0" distL="0" distR="0" wp14:anchorId="4275524E" wp14:editId="70DEEADF">
+            <wp:extent cx="5600700" cy="3702646"/>
+            <wp:effectExtent l="0" t="0" r="0" b="0"/>
             <wp:docPr id="2192607" name="Picture 17"/>
             <wp:cNvGraphicFramePr>
               <a:graphicFrameLocks xmlns:a="http://schemas.openxmlformats.org/drawingml/2006/main" noChangeAspect="1"/>
@@ -20937,7 +20941,7 @@
                   <pic:spPr bwMode="auto">
                     <a:xfrm>
                       <a:off x="0" y="0"/>
-                      <a:ext cx="5935980" cy="3924300"/>
+                      <a:ext cx="5623213" cy="3717529"/>
                     </a:xfrm>
                     <a:prstGeom prst="rect">
                       <a:avLst/>
@@ -20953,13 +20957,6 @@
           </wp:inline>
         </w:drawing>
       </w:r>
-      <w:r>
-        <w:rPr>
-          <w:i/>
-          <w:iCs/>
-        </w:rPr>
-        <w:t xml:space="preserve"> </w:t>
-      </w:r>
     </w:p>
     <w:p>
       <w:pPr>
@@ -20994,8 +20991,10 @@
         <w:rPr>
           <w:i/>
           <w:iCs/>
-          <w:lang w:val="vi-VN"/>
-        </w:rPr>
+          <w:noProof/>
+          <w:lang w:val="vi-VN"/>
+        </w:rPr>
+        <w:lastRenderedPageBreak/>
         <w:drawing>
           <wp:inline distT="0" distB="0" distL="0" distR="0" wp14:anchorId="29E34BEF" wp14:editId="0C331647">
             <wp:extent cx="5928360" cy="3512820"/>
@@ -21076,7 +21075,288 @@
         <w:t>Figure E: Clients enter Passive Mode using PASV. While a client sends a large file to the server, another client can retrieve a file from the server without affecting the other client.</w:t>
       </w:r>
     </w:p>
-    <w:p/>
+    <w:p>
+      <w:pPr>
+        <w:jc w:val="center"/>
+        <w:rPr>
+          <w:i/>
+          <w:iCs/>
+          <w:color w:val="44546A" w:themeColor="text2"/>
+          <w:sz w:val="18"/>
+          <w:szCs w:val="18"/>
+        </w:rPr>
+      </w:pPr>
+      <w:r>
+        <w:rPr>
+          <w:i/>
+          <w:iCs/>
+          <w:noProof/>
+          <w:color w:val="44546A" w:themeColor="text2"/>
+          <w:sz w:val="18"/>
+          <w:szCs w:val="18"/>
+        </w:rPr>
+        <w:drawing>
+          <wp:inline distT="0" distB="0" distL="0" distR="0" wp14:anchorId="6BBE5367" wp14:editId="32E5675F">
+            <wp:extent cx="5928360" cy="3520440"/>
+            <wp:effectExtent l="0" t="0" r="0" b="3810"/>
+            <wp:docPr id="1034614856" name="Picture 3"/>
+            <wp:cNvGraphicFramePr>
+              <a:graphicFrameLocks xmlns:a="http://schemas.openxmlformats.org/drawingml/2006/main" noChangeAspect="1"/>
+            </wp:cNvGraphicFramePr>
+            <a:graphic xmlns:a="http://schemas.openxmlformats.org/drawingml/2006/main">
+              <a:graphicData uri="http://schemas.openxmlformats.org/drawingml/2006/picture">
+                <pic:pic xmlns:pic="http://schemas.openxmlformats.org/drawingml/2006/picture">
+                  <pic:nvPicPr>
+                    <pic:cNvPr id="0" name="Picture 3"/>
+                    <pic:cNvPicPr>
+                      <a:picLocks noChangeAspect="1" noChangeArrowheads="1"/>
+                    </pic:cNvPicPr>
+                  </pic:nvPicPr>
+                  <pic:blipFill>
+                    <a:blip r:embed="rId25" cstate="print">
+                      <a:extLst>
+                        <a:ext uri="{28A0092B-C50C-407E-A947-70E740481C1C}">
+                          <a14:useLocalDpi xmlns:a14="http://schemas.microsoft.com/office/drawing/2010/main" val="0"/>
+                        </a:ext>
+                      </a:extLst>
+                    </a:blip>
+                    <a:srcRect/>
+                    <a:stretch>
+                      <a:fillRect/>
+                    </a:stretch>
+                  </pic:blipFill>
+                  <pic:spPr bwMode="auto">
+                    <a:xfrm>
+                      <a:off x="0" y="0"/>
+                      <a:ext cx="5928360" cy="3520440"/>
+                    </a:xfrm>
+                    <a:prstGeom prst="rect">
+                      <a:avLst/>
+                    </a:prstGeom>
+                    <a:noFill/>
+                    <a:ln>
+                      <a:noFill/>
+                    </a:ln>
+                  </pic:spPr>
+                </pic:pic>
+              </a:graphicData>
+            </a:graphic>
+          </wp:inline>
+        </w:drawing>
+      </w:r>
+    </w:p>
+    <w:p>
+      <w:pPr>
+        <w:jc w:val="center"/>
+        <w:rPr>
+          <w:noProof/>
+        </w:rPr>
+      </w:pPr>
+      <w:r>
+        <w:rPr>
+          <w:i/>
+          <w:iCs/>
+          <w:color w:val="44546A" w:themeColor="text2"/>
+          <w:sz w:val="18"/>
+          <w:szCs w:val="18"/>
+        </w:rPr>
+        <w:t xml:space="preserve">Figure </w:t>
+      </w:r>
+      <w:r>
+        <w:rPr>
+          <w:i/>
+          <w:iCs/>
+          <w:color w:val="44546A" w:themeColor="text2"/>
+          <w:sz w:val="18"/>
+          <w:szCs w:val="18"/>
+        </w:rPr>
+        <w:t>F</w:t>
+      </w:r>
+      <w:r>
+        <w:rPr>
+          <w:i/>
+          <w:iCs/>
+          <w:color w:val="44546A" w:themeColor="text2"/>
+          <w:sz w:val="18"/>
+          <w:szCs w:val="18"/>
+        </w:rPr>
+        <w:t xml:space="preserve">: Clients enter </w:t>
+      </w:r>
+      <w:r>
+        <w:rPr>
+          <w:i/>
+          <w:iCs/>
+          <w:color w:val="44546A" w:themeColor="text2"/>
+          <w:sz w:val="18"/>
+          <w:szCs w:val="18"/>
+        </w:rPr>
+        <w:t>Active</w:t>
+      </w:r>
+      <w:r>
+        <w:rPr>
+          <w:i/>
+          <w:iCs/>
+          <w:color w:val="44546A" w:themeColor="text2"/>
+          <w:sz w:val="18"/>
+          <w:szCs w:val="18"/>
+        </w:rPr>
+        <w:t xml:space="preserve"> Mode using </w:t>
+      </w:r>
+      <w:r>
+        <w:rPr>
+          <w:i/>
+          <w:iCs/>
+          <w:color w:val="44546A" w:themeColor="text2"/>
+          <w:sz w:val="18"/>
+          <w:szCs w:val="18"/>
+        </w:rPr>
+        <w:t>PORT</w:t>
+      </w:r>
+      <w:r>
+        <w:rPr>
+          <w:i/>
+          <w:iCs/>
+          <w:color w:val="44546A" w:themeColor="text2"/>
+          <w:sz w:val="18"/>
+          <w:szCs w:val="18"/>
+        </w:rPr>
+        <w:t xml:space="preserve">. </w:t>
+      </w:r>
+      <w:r>
+        <w:rPr>
+          <w:i/>
+          <w:iCs/>
+          <w:color w:val="44546A" w:themeColor="text2"/>
+          <w:sz w:val="18"/>
+          <w:szCs w:val="18"/>
+        </w:rPr>
+        <w:t xml:space="preserve">A client executes APPE which appends data to the existing file on the server, and the other </w:t>
+      </w:r>
+      <w:r>
+        <w:rPr>
+          <w:i/>
+          <w:iCs/>
+          <w:color w:val="44546A" w:themeColor="text2"/>
+          <w:sz w:val="18"/>
+          <w:szCs w:val="18"/>
+        </w:rPr>
+        <w:t xml:space="preserve">client </w:t>
+      </w:r>
+      <w:r>
+        <w:rPr>
+          <w:i/>
+          <w:iCs/>
+          <w:color w:val="44546A" w:themeColor="text2"/>
+          <w:sz w:val="18"/>
+          <w:szCs w:val="18"/>
+        </w:rPr>
+        <w:t>executes STOU which creates a new file with a unique filename.</w:t>
+      </w:r>
+      <w:r>
+        <w:rPr>
+          <w:noProof/>
+        </w:rPr>
+        <w:t xml:space="preserve"> </w:t>
+      </w:r>
+    </w:p>
+    <w:p>
+      <w:pPr>
+        <w:jc w:val="center"/>
+      </w:pPr>
+      <w:r>
+        <w:rPr>
+          <w:i/>
+          <w:iCs/>
+          <w:color w:val="44546A" w:themeColor="text2"/>
+          <w:sz w:val="18"/>
+          <w:szCs w:val="18"/>
+        </w:rPr>
+        <w:lastRenderedPageBreak/>
+        <w:drawing>
+          <wp:inline distT="0" distB="0" distL="0" distR="0" wp14:anchorId="67A1E947" wp14:editId="788DB021">
+            <wp:extent cx="5943600" cy="1131570"/>
+            <wp:effectExtent l="0" t="0" r="0" b="0"/>
+            <wp:docPr id="405780021" name="Picture 1"/>
+            <wp:cNvGraphicFramePr>
+              <a:graphicFrameLocks xmlns:a="http://schemas.openxmlformats.org/drawingml/2006/main" noChangeAspect="1"/>
+            </wp:cNvGraphicFramePr>
+            <a:graphic xmlns:a="http://schemas.openxmlformats.org/drawingml/2006/main">
+              <a:graphicData uri="http://schemas.openxmlformats.org/drawingml/2006/picture">
+                <pic:pic xmlns:pic="http://schemas.openxmlformats.org/drawingml/2006/picture">
+                  <pic:nvPicPr>
+                    <pic:cNvPr id="405780021" name=""/>
+                    <pic:cNvPicPr/>
+                  </pic:nvPicPr>
+                  <pic:blipFill>
+                    <a:blip r:embed="rId26"/>
+                    <a:stretch>
+                      <a:fillRect/>
+                    </a:stretch>
+                  </pic:blipFill>
+                  <pic:spPr>
+                    <a:xfrm>
+                      <a:off x="0" y="0"/>
+                      <a:ext cx="5943600" cy="1131570"/>
+                    </a:xfrm>
+                    <a:prstGeom prst="rect">
+                      <a:avLst/>
+                    </a:prstGeom>
+                  </pic:spPr>
+                </pic:pic>
+              </a:graphicData>
+            </a:graphic>
+          </wp:inline>
+        </w:drawing>
+      </w:r>
+    </w:p>
+    <w:p>
+      <w:pPr>
+        <w:jc w:val="center"/>
+        <w:rPr>
+          <w:noProof/>
+        </w:rPr>
+      </w:pPr>
+      <w:r>
+        <w:rPr>
+          <w:i/>
+          <w:iCs/>
+          <w:color w:val="44546A" w:themeColor="text2"/>
+          <w:sz w:val="18"/>
+          <w:szCs w:val="18"/>
+        </w:rPr>
+        <w:t xml:space="preserve">Figure </w:t>
+      </w:r>
+      <w:r>
+        <w:rPr>
+          <w:i/>
+          <w:iCs/>
+          <w:color w:val="44546A" w:themeColor="text2"/>
+          <w:sz w:val="18"/>
+          <w:szCs w:val="18"/>
+        </w:rPr>
+        <w:t>G</w:t>
+      </w:r>
+      <w:r>
+        <w:rPr>
+          <w:i/>
+          <w:iCs/>
+          <w:color w:val="44546A" w:themeColor="text2"/>
+          <w:sz w:val="18"/>
+          <w:szCs w:val="18"/>
+        </w:rPr>
+        <w:t xml:space="preserve">: </w:t>
+      </w:r>
+      <w:r>
+        <w:rPr>
+          <w:i/>
+          <w:iCs/>
+          <w:color w:val="44546A" w:themeColor="text2"/>
+          <w:sz w:val="18"/>
+          <w:szCs w:val="18"/>
+        </w:rPr>
+        <w:t>Client can abort the data transferring process.</w:t>
+      </w:r>
+    </w:p>
     <w:p>
       <w:pPr>
         <w:pStyle w:val="Heading1"/>
@@ -21109,8 +21389,8 @@
       </w:pPr>
     </w:p>
     <w:sectPr>
-      <w:headerReference w:type="default" r:id="rId25"/>
-      <w:footerReference w:type="default" r:id="rId26"/>
+      <w:headerReference w:type="default" r:id="rId27"/>
+      <w:footerReference w:type="default" r:id="rId28"/>
       <w:pgSz w:w="12240" w:h="15840"/>
       <w:pgMar w:top="1440" w:right="1440" w:bottom="1440" w:left="1440" w:header="720" w:footer="720" w:gutter="0"/>
       <w:pgNumType w:start="0"/>
@@ -27317,7 +27597,7 @@
   <w:style w:type="paragraph" w:default="1" w:styleId="Normal">
     <w:name w:val="Normal"/>
     <w:qFormat/>
-    <w:rsid w:val="00CB71CA"/>
+    <w:rsid w:val="000B2E64"/>
     <w:pPr>
       <w:spacing w:after="120"/>
       <w:jc w:val="both"/>
@@ -27530,6 +27810,7 @@
   <w:style w:type="character" w:default="1" w:styleId="DefaultParagraphFont">
     <w:name w:val="Default Paragraph Font"/>
     <w:uiPriority w:val="1"/>
+    <w:semiHidden/>
     <w:unhideWhenUsed/>
   </w:style>
   <w:style w:type="table" w:default="1" w:styleId="TableNormal">

</xml_diff>